<commit_message>
Lab report: Appendix C names the screenshots' source (the web game at structrender.vercel.app)
Co-Authored-By: Claude Opus 5.5 <noreply@anthropic.com>
Claude-Session: https://claude.ai/code/session_017tCN9U8Bqx9WnkpxSeFvHJ
</commit_message>
<xml_diff>
--- a/docs/lab_report/StructRender_Lab_Report.docx
+++ b/docs/lab_report/StructRender_Lab_Report.docx
@@ -224,7 +224,7 @@
         <w:pStyle w:val="FrontHeading"/>
         <w:rPr/>
       </w:pPr>
-      <w:bookmarkStart w:id="0" w:name="__RefHeading___Toc2074_2555388784"/>
+      <w:bookmarkStart w:id="0" w:name="__RefHeading___Toc2074_1190944670"/>
       <w:bookmarkEnd w:id="0"/>
       <w:r>
         <w:rPr/>
@@ -342,7 +342,7 @@
             </w:rPr>
             <w:fldChar w:fldCharType="separate"/>
           </w:r>
-          <w:hyperlink w:anchor="__RefHeading___Toc2074_2555388784" w:tooltip="ABSTRACT">
+          <w:hyperlink w:anchor="__RefHeading___Toc2074_1190944670" w:tooltip="ABSTRACT">
             <w:r>
               <w:rPr>
                 <w:rStyle w:val="IndexLink"/>
@@ -362,7 +362,7 @@
             </w:tabs>
             <w:rPr/>
           </w:pPr>
-          <w:hyperlink w:anchor="__RefHeading___Toc2076_2555388784" w:tooltip="LIST OF TABLES">
+          <w:hyperlink w:anchor="__RefHeading___Toc2076_1190944670" w:tooltip="LIST OF TABLES">
             <w:r>
               <w:rPr>
                 <w:rStyle w:val="IndexLink"/>
@@ -382,7 +382,7 @@
             </w:tabs>
             <w:rPr/>
           </w:pPr>
-          <w:hyperlink w:anchor="__RefHeading___Toc2078_2555388784" w:tooltip="LIST OF FIGURES">
+          <w:hyperlink w:anchor="__RefHeading___Toc2078_1190944670" w:tooltip="LIST OF FIGURES">
             <w:r>
               <w:rPr>
                 <w:rStyle w:val="IndexLink"/>
@@ -402,7 +402,7 @@
             </w:tabs>
             <w:rPr/>
           </w:pPr>
-          <w:hyperlink w:anchor="__RefHeading___Toc2080_2555388784" w:tooltip="LIST OF ABBREVIATIONS">
+          <w:hyperlink w:anchor="__RefHeading___Toc2080_1190944670" w:tooltip="LIST OF ABBREVIATIONS">
             <w:r>
               <w:rPr>
                 <w:rStyle w:val="IndexLink"/>
@@ -422,7 +422,7 @@
             </w:tabs>
             <w:rPr/>
           </w:pPr>
-          <w:hyperlink w:anchor="__RefHeading___Toc2082_2555388784" w:tooltip="CHAPTER 1: INTRODUCTION">
+          <w:hyperlink w:anchor="__RefHeading___Toc2082_1190944670" w:tooltip="CHAPTER 1: INTRODUCTION">
             <w:r>
               <w:rPr>
                 <w:rStyle w:val="IndexLink"/>
@@ -442,7 +442,7 @@
             </w:tabs>
             <w:rPr/>
           </w:pPr>
-          <w:hyperlink w:anchor="__RefHeading___Toc2084_2555388784" w:tooltip="1.1 Project Overview">
+          <w:hyperlink w:anchor="__RefHeading___Toc2084_1190944670" w:tooltip="1.1 Project Overview">
             <w:r>
               <w:rPr>
                 <w:rStyle w:val="IndexLink"/>
@@ -462,7 +462,7 @@
             </w:tabs>
             <w:rPr/>
           </w:pPr>
-          <w:hyperlink w:anchor="__RefHeading___Toc2086_2555388784" w:tooltip="1.2 Problem Statement">
+          <w:hyperlink w:anchor="__RefHeading___Toc2086_1190944670" w:tooltip="1.2 Problem Statement">
             <w:r>
               <w:rPr>
                 <w:rStyle w:val="IndexLink"/>
@@ -482,7 +482,7 @@
             </w:tabs>
             <w:rPr/>
           </w:pPr>
-          <w:hyperlink w:anchor="__RefHeading___Toc2088_2555388784" w:tooltip="1.3 Objectives">
+          <w:hyperlink w:anchor="__RefHeading___Toc2088_1190944670" w:tooltip="1.3 Objectives">
             <w:r>
               <w:rPr>
                 <w:rStyle w:val="IndexLink"/>
@@ -502,7 +502,7 @@
             </w:tabs>
             <w:rPr/>
           </w:pPr>
-          <w:hyperlink w:anchor="__RefHeading___Toc2090_2555388784" w:tooltip="1.4 Scope of Work and Social Contribution">
+          <w:hyperlink w:anchor="__RefHeading___Toc2090_1190944670" w:tooltip="1.4 Scope of Work and Social Contribution">
             <w:r>
               <w:rPr>
                 <w:rStyle w:val="IndexLink"/>
@@ -522,7 +522,7 @@
             </w:tabs>
             <w:rPr/>
           </w:pPr>
-          <w:hyperlink w:anchor="__RefHeading___Toc2092_2555388784" w:tooltip="CHAPTER 2: LITERATURE REVIEW">
+          <w:hyperlink w:anchor="__RefHeading___Toc2092_1190944670" w:tooltip="CHAPTER 2: LITERATURE REVIEW">
             <w:r>
               <w:rPr>
                 <w:rStyle w:val="IndexLink"/>
@@ -542,7 +542,7 @@
             </w:tabs>
             <w:rPr/>
           </w:pPr>
-          <w:hyperlink w:anchor="__RefHeading___Toc2094_2555388784" w:tooltip="2.1 Background">
+          <w:hyperlink w:anchor="__RefHeading___Toc2094_1190944670" w:tooltip="2.1 Background">
             <w:r>
               <w:rPr>
                 <w:rStyle w:val="IndexLink"/>
@@ -562,7 +562,7 @@
             </w:tabs>
             <w:rPr/>
           </w:pPr>
-          <w:hyperlink w:anchor="__RefHeading___Toc2096_2555388784" w:tooltip="2.1.1 Review of Related Work">
+          <w:hyperlink w:anchor="__RefHeading___Toc2096_1190944670" w:tooltip="2.1.1 Review of Related Work">
             <w:r>
               <w:rPr>
                 <w:rStyle w:val="IndexLink"/>
@@ -582,7 +582,7 @@
             </w:tabs>
             <w:rPr/>
           </w:pPr>
-          <w:hyperlink w:anchor="__RefHeading___Toc2098_2555388784" w:tooltip="2.2 Research Gaps">
+          <w:hyperlink w:anchor="__RefHeading___Toc2098_1190944670" w:tooltip="2.2 Research Gaps">
             <w:r>
               <w:rPr>
                 <w:rStyle w:val="IndexLink"/>
@@ -602,7 +602,7 @@
             </w:tabs>
             <w:rPr/>
           </w:pPr>
-          <w:hyperlink w:anchor="__RefHeading___Toc2100_2555388784" w:tooltip="CHAPTER 3: PROPOSED METHODOLOGY">
+          <w:hyperlink w:anchor="__RefHeading___Toc2100_1190944670" w:tooltip="CHAPTER 3: PROPOSED METHODOLOGY">
             <w:r>
               <w:rPr>
                 <w:rStyle w:val="IndexLink"/>
@@ -622,7 +622,7 @@
             </w:tabs>
             <w:rPr/>
           </w:pPr>
-          <w:hyperlink w:anchor="__RefHeading___Toc2102_2555388784" w:tooltip="3.1 Architecture in a Nutshell">
+          <w:hyperlink w:anchor="__RefHeading___Toc2102_1190944670" w:tooltip="3.1 Architecture in a Nutshell">
             <w:r>
               <w:rPr>
                 <w:rStyle w:val="IndexLink"/>
@@ -642,7 +642,7 @@
             </w:tabs>
             <w:rPr/>
           </w:pPr>
-          <w:hyperlink w:anchor="__RefHeading___Toc2104_2555388784" w:tooltip="3.1.1 Dataset Description">
+          <w:hyperlink w:anchor="__RefHeading___Toc2104_1190944670" w:tooltip="3.1.1 Dataset Description">
             <w:r>
               <w:rPr>
                 <w:rStyle w:val="IndexLink"/>
@@ -662,7 +662,7 @@
             </w:tabs>
             <w:rPr/>
           </w:pPr>
-          <w:hyperlink w:anchor="__RefHeading___Toc2106_2555388784" w:tooltip="3.1.2 Preprocessing">
+          <w:hyperlink w:anchor="__RefHeading___Toc2106_1190944670" w:tooltip="3.1.2 Preprocessing">
             <w:r>
               <w:rPr>
                 <w:rStyle w:val="IndexLink"/>
@@ -682,7 +682,7 @@
             </w:tabs>
             <w:rPr/>
           </w:pPr>
-          <w:hyperlink w:anchor="__RefHeading___Toc2108_2555388784" w:tooltip="3.1.3 Encoder Layer (Feature-Extraction and Rendering Network)">
+          <w:hyperlink w:anchor="__RefHeading___Toc2108_1190944670" w:tooltip="3.1.3 Encoder Layer (Feature-Extraction and Rendering Network)">
             <w:r>
               <w:rPr>
                 <w:rStyle w:val="IndexLink"/>
@@ -702,7 +702,7 @@
             </w:tabs>
             <w:rPr/>
           </w:pPr>
-          <w:hyperlink w:anchor="__RefHeading___Toc2110_2555388784" w:tooltip="3.2 Hardware Specifications">
+          <w:hyperlink w:anchor="__RefHeading___Toc2110_1190944670" w:tooltip="3.2 Hardware Specifications">
             <w:r>
               <w:rPr>
                 <w:rStyle w:val="IndexLink"/>
@@ -722,7 +722,7 @@
             </w:tabs>
             <w:rPr/>
           </w:pPr>
-          <w:hyperlink w:anchor="__RefHeading___Toc2112_2555388784" w:tooltip="3.3 Software Specifications">
+          <w:hyperlink w:anchor="__RefHeading___Toc2112_1190944670" w:tooltip="3.3 Software Specifications">
             <w:r>
               <w:rPr>
                 <w:rStyle w:val="IndexLink"/>
@@ -742,7 +742,7 @@
             </w:tabs>
             <w:rPr/>
           </w:pPr>
-          <w:hyperlink w:anchor="__RefHeading___Toc2114_2555388784" w:tooltip="CHAPTER 4: PERFORMANCE EVALUATION">
+          <w:hyperlink w:anchor="__RefHeading___Toc2114_1190944670" w:tooltip="CHAPTER 4: PERFORMANCE EVALUATION">
             <w:r>
               <w:rPr>
                 <w:rStyle w:val="IndexLink"/>
@@ -762,7 +762,7 @@
             </w:tabs>
             <w:rPr/>
           </w:pPr>
-          <w:hyperlink w:anchor="__RefHeading___Toc2116_2555388784" w:tooltip="4.1 Experimental Setup">
+          <w:hyperlink w:anchor="__RefHeading___Toc2116_1190944670" w:tooltip="4.1 Experimental Setup">
             <w:r>
               <w:rPr>
                 <w:rStyle w:val="IndexLink"/>
@@ -782,7 +782,7 @@
             </w:tabs>
             <w:rPr/>
           </w:pPr>
-          <w:hyperlink w:anchor="__RefHeading___Toc2118_2555388784" w:tooltip="4.2 Evaluation Metrics">
+          <w:hyperlink w:anchor="__RefHeading___Toc2118_1190944670" w:tooltip="4.2 Evaluation Metrics">
             <w:r>
               <w:rPr>
                 <w:rStyle w:val="IndexLink"/>
@@ -802,7 +802,7 @@
             </w:tabs>
             <w:rPr/>
           </w:pPr>
-          <w:hyperlink w:anchor="__RefHeading___Toc2120_2555388784" w:tooltip="4.3 Results and Analysis">
+          <w:hyperlink w:anchor="__RefHeading___Toc2120_1190944670" w:tooltip="4.3 Results and Analysis">
             <w:r>
               <w:rPr>
                 <w:rStyle w:val="IndexLink"/>
@@ -822,7 +822,7 @@
             </w:tabs>
             <w:rPr/>
           </w:pPr>
-          <w:hyperlink w:anchor="__RefHeading___Toc2122_2555388784" w:tooltip="4.3.1 Training Behaviour">
+          <w:hyperlink w:anchor="__RefHeading___Toc2122_1190944670" w:tooltip="4.3.1 Training Behaviour">
             <w:r>
               <w:rPr>
                 <w:rStyle w:val="IndexLink"/>
@@ -842,7 +842,7 @@
             </w:tabs>
             <w:rPr/>
           </w:pPr>
-          <w:hyperlink w:anchor="__RefHeading___Toc2124_2555388784" w:tooltip="4.3.2 Ablation Ladder">
+          <w:hyperlink w:anchor="__RefHeading___Toc2124_1190944670" w:tooltip="4.3.2 Ablation Ladder">
             <w:r>
               <w:rPr>
                 <w:rStyle w:val="IndexLink"/>
@@ -862,7 +862,7 @@
             </w:tabs>
             <w:rPr/>
           </w:pPr>
-          <w:hyperlink w:anchor="__RefHeading___Toc2126_2555388784" w:tooltip="4.3.3 The Deployed Two-Style Model">
+          <w:hyperlink w:anchor="__RefHeading___Toc2126_1190944670" w:tooltip="4.3.3 The Deployed Two-Style Model">
             <w:r>
               <w:rPr>
                 <w:rStyle w:val="IndexLink"/>
@@ -882,7 +882,7 @@
             </w:tabs>
             <w:rPr/>
           </w:pPr>
-          <w:hyperlink w:anchor="__RefHeading___Toc2128_2555388784" w:tooltip="4.3.4 Live Deployment">
+          <w:hyperlink w:anchor="__RefHeading___Toc2128_1190944670" w:tooltip="4.3.4 Live Deployment">
             <w:r>
               <w:rPr>
                 <w:rStyle w:val="IndexLink"/>
@@ -902,7 +902,7 @@
             </w:tabs>
             <w:rPr/>
           </w:pPr>
-          <w:hyperlink w:anchor="__RefHeading___Toc2130_2555388784" w:tooltip="4.3.5 Assessment of Objectives and Limitations">
+          <w:hyperlink w:anchor="__RefHeading___Toc2130_1190944670" w:tooltip="4.3.5 Assessment of Objectives and Limitations">
             <w:r>
               <w:rPr>
                 <w:rStyle w:val="IndexLink"/>
@@ -922,7 +922,7 @@
             </w:tabs>
             <w:rPr/>
           </w:pPr>
-          <w:hyperlink w:anchor="__RefHeading___Toc2132_2555388784" w:tooltip="CHAPTER 5: CONCLUSION AND FUTURE WORK">
+          <w:hyperlink w:anchor="__RefHeading___Toc2132_1190944670" w:tooltip="CHAPTER 5: CONCLUSION AND FUTURE WORK">
             <w:r>
               <w:rPr>
                 <w:rStyle w:val="IndexLink"/>
@@ -942,7 +942,7 @@
             </w:tabs>
             <w:rPr/>
           </w:pPr>
-          <w:hyperlink w:anchor="__RefHeading___Toc2134_2555388784" w:tooltip="5.1 Summary of the Contributions">
+          <w:hyperlink w:anchor="__RefHeading___Toc2134_1190944670" w:tooltip="5.1 Summary of the Contributions">
             <w:r>
               <w:rPr>
                 <w:rStyle w:val="IndexLink"/>
@@ -962,7 +962,7 @@
             </w:tabs>
             <w:rPr/>
           </w:pPr>
-          <w:hyperlink w:anchor="__RefHeading___Toc2136_2555388784" w:tooltip="5.2 Future Work">
+          <w:hyperlink w:anchor="__RefHeading___Toc2136_1190944670" w:tooltip="5.2 Future Work">
             <w:r>
               <w:rPr>
                 <w:rStyle w:val="IndexLink"/>
@@ -982,7 +982,7 @@
             </w:tabs>
             <w:rPr/>
           </w:pPr>
-          <w:hyperlink w:anchor="__RefHeading___Toc2138_2555388784" w:tooltip="REFERENCES">
+          <w:hyperlink w:anchor="__RefHeading___Toc2138_1190944670" w:tooltip="REFERENCES">
             <w:r>
               <w:rPr>
                 <w:rStyle w:val="IndexLink"/>
@@ -1002,7 +1002,7 @@
             </w:tabs>
             <w:rPr/>
           </w:pPr>
-          <w:hyperlink w:anchor="__RefHeading___Toc2140_2555388784" w:tooltip="APPENDICES">
+          <w:hyperlink w:anchor="__RefHeading___Toc2140_1190944670" w:tooltip="APPENDICES">
             <w:r>
               <w:rPr>
                 <w:rStyle w:val="IndexLink"/>
@@ -1022,7 +1022,7 @@
             </w:tabs>
             <w:rPr/>
           </w:pPr>
-          <w:hyperlink w:anchor="__RefHeading___Toc2142_2555388784" w:tooltip="Appendix A: Deployed Model Configuration (abridged)">
+          <w:hyperlink w:anchor="__RefHeading___Toc2142_1190944670" w:tooltip="Appendix A: Deployed Model Configuration (abridged)">
             <w:r>
               <w:rPr>
                 <w:rStyle w:val="IndexLink"/>
@@ -1042,7 +1042,7 @@
             </w:tabs>
             <w:rPr/>
           </w:pPr>
-          <w:hyperlink w:anchor="__RefHeading___Toc2144_2555388784" w:tooltip="Appendix B: Milestone Scorecard">
+          <w:hyperlink w:anchor="__RefHeading___Toc2144_1190944670" w:tooltip="Appendix B: Milestone Scorecard">
             <w:r>
               <w:rPr>
                 <w:rStyle w:val="IndexLink"/>
@@ -1062,7 +1062,7 @@
             </w:tabs>
             <w:rPr/>
           </w:pPr>
-          <w:hyperlink w:anchor="__RefHeading___Toc2146_2555388784" w:tooltip="Appendix C: Supplementary Screenshots">
+          <w:hyperlink w:anchor="__RefHeading___Toc2146_1190944670" w:tooltip="Appendix C: Supplementary Screenshots">
             <w:r>
               <w:rPr>
                 <w:rStyle w:val="IndexLink"/>
@@ -1095,7 +1095,7 @@
         <w:pStyle w:val="FrontHeading"/>
         <w:rPr/>
       </w:pPr>
-      <w:bookmarkStart w:id="1" w:name="__RefHeading___Toc2076_2555388784"/>
+      <w:bookmarkStart w:id="1" w:name="__RefHeading___Toc2076_1190944670"/>
       <w:bookmarkEnd w:id="1"/>
       <w:r>
         <w:rPr/>
@@ -1134,7 +1134,7 @@
             </w:rPr>
             <w:fldChar w:fldCharType="separate"/>
           </w:r>
-          <w:hyperlink w:anchor="__RefHeading___Toc2148_2555388784" w:tooltip="Table 2.1: Comparison of related work">
+          <w:hyperlink w:anchor="__RefHeading___Toc2148_1190944670" w:tooltip="Table 2.1: Comparison of related work">
             <w:r>
               <w:rPr>
                 <w:rStyle w:val="IndexLink"/>
@@ -1154,7 +1154,7 @@
             </w:tabs>
             <w:rPr/>
           </w:pPr>
-          <w:hyperlink w:anchor="__RefHeading___Toc2176_2555388784" w:tooltip="Table 2.2: Research gaps and how StructRender addresses them">
+          <w:hyperlink w:anchor="__RefHeading___Toc2176_1190944670" w:tooltip="Table 2.2: Research gaps and how StructRender addresses them">
             <w:r>
               <w:rPr>
                 <w:rStyle w:val="IndexLink"/>
@@ -1174,7 +1174,7 @@
             </w:tabs>
             <w:rPr/>
           </w:pPr>
-          <w:hyperlink w:anchor="__RefHeading___Toc2174_2555388784" w:tooltip="Table 3.1: Dataset summary">
+          <w:hyperlink w:anchor="__RefHeading___Toc2174_1190944670" w:tooltip="Table 3.1: Dataset summary">
             <w:r>
               <w:rPr>
                 <w:rStyle w:val="IndexLink"/>
@@ -1194,7 +1194,7 @@
             </w:tabs>
             <w:rPr/>
           </w:pPr>
-          <w:hyperlink w:anchor="__RefHeading___Toc2172_2555388784" w:tooltip="Table 3.2: Offline teacher configuration">
+          <w:hyperlink w:anchor="__RefHeading___Toc2172_1190944670" w:tooltip="Table 3.2: Offline teacher configuration">
             <w:r>
               <w:rPr>
                 <w:rStyle w:val="IndexLink"/>
@@ -1214,7 +1214,7 @@
             </w:tabs>
             <w:rPr/>
           </w:pPr>
-          <w:hyperlink w:anchor="__RefHeading___Toc2170_2555388784" w:tooltip="Table 3.3: Alignment gates (thresholds fixed before the data)">
+          <w:hyperlink w:anchor="__RefHeading___Toc2170_1190944670" w:tooltip="Table 3.3: Alignment gates (thresholds fixed before the data)">
             <w:r>
               <w:rPr>
                 <w:rStyle w:val="IndexLink"/>
@@ -1234,7 +1234,7 @@
             </w:tabs>
             <w:rPr/>
           </w:pPr>
-          <w:hyperlink w:anchor="__RefHeading___Toc2168_2555388784" w:tooltip="Table 3.4: Parameters of StyleTemporalUNet by block (counted from the model)">
+          <w:hyperlink w:anchor="__RefHeading___Toc2168_1190944670" w:tooltip="Table 3.4: Parameters of StyleTemporalUNet by block (counted from the model)">
             <w:r>
               <w:rPr>
                 <w:rStyle w:val="IndexLink"/>
@@ -1254,7 +1254,7 @@
             </w:tabs>
             <w:rPr/>
           </w:pPr>
-          <w:hyperlink w:anchor="__RefHeading___Toc2166_2555388784" w:tooltip="Table 3.5: Hardware used for all experiments">
+          <w:hyperlink w:anchor="__RefHeading___Toc2166_1190944670" w:tooltip="Table 3.5: Hardware used for all experiments">
             <w:r>
               <w:rPr>
                 <w:rStyle w:val="IndexLink"/>
@@ -1274,7 +1274,7 @@
             </w:tabs>
             <w:rPr/>
           </w:pPr>
-          <w:hyperlink w:anchor="__RefHeading___Toc2164_2555388784" w:tooltip="Table 3.6: Software environment (versions read from the environment)">
+          <w:hyperlink w:anchor="__RefHeading___Toc2164_1190944670" w:tooltip="Table 3.6: Software environment (versions read from the environment)">
             <w:r>
               <w:rPr>
                 <w:rStyle w:val="IndexLink"/>
@@ -1294,7 +1294,7 @@
             </w:tabs>
             <w:rPr/>
           </w:pPr>
-          <w:hyperlink w:anchor="__RefHeading___Toc2162_2555388784" w:tooltip="Table 4.1: Training and evaluation configuration of the deployed model">
+          <w:hyperlink w:anchor="__RefHeading___Toc2162_1190944670" w:tooltip="Table 4.1: Training and evaluation configuration of the deployed model">
             <w:r>
               <w:rPr>
                 <w:rStyle w:val="IndexLink"/>
@@ -1314,7 +1314,7 @@
             </w:tabs>
             <w:rPr/>
           </w:pPr>
-          <w:hyperlink w:anchor="__RefHeading___Toc2160_2555388784" w:tooltip="Table 4.2: Ablation ladder on the sealed seed-scene test split">
+          <w:hyperlink w:anchor="__RefHeading___Toc2160_1190944670" w:tooltip="Table 4.2: Ablation ladder on the sealed seed-scene test split">
             <w:r>
               <w:rPr>
                 <w:rStyle w:val="IndexLink"/>
@@ -1334,7 +1334,7 @@
             </w:tabs>
             <w:rPr/>
           </w:pPr>
-          <w:hyperlink w:anchor="__RefHeading___Toc2158_2555388784" w:tooltip="Table 4.3: Game test sessions (2,968 frames per style)">
+          <w:hyperlink w:anchor="__RefHeading___Toc2158_1190944670" w:tooltip="Table 4.3: Game test sessions (2,968 frames per style)">
             <w:r>
               <w:rPr>
                 <w:rStyle w:val="IndexLink"/>
@@ -1354,7 +1354,7 @@
             </w:tabs>
             <w:rPr/>
           </w:pPr>
-          <w:hyperlink w:anchor="__RefHeading___Toc2156_2555388784" w:tooltip="Table 4.4: Equivalence chain from evaluator to live game">
+          <w:hyperlink w:anchor="__RefHeading___Toc2156_1190944670" w:tooltip="Table 4.4: Equivalence chain from evaluator to live game">
             <w:r>
               <w:rPr>
                 <w:rStyle w:val="IndexLink"/>
@@ -1374,7 +1374,7 @@
             </w:tabs>
             <w:rPr/>
           </w:pPr>
-          <w:hyperlink w:anchor="__RefHeading___Toc2154_2555388784" w:tooltip="Table 4.5: M10 exit criteria, measured on the playable game">
+          <w:hyperlink w:anchor="__RefHeading___Toc2154_1190944670" w:tooltip="Table 4.5: M10 exit criteria, measured on the playable game">
             <w:r>
               <w:rPr>
                 <w:rStyle w:val="IndexLink"/>
@@ -1394,7 +1394,7 @@
             </w:tabs>
             <w:rPr/>
           </w:pPr>
-          <w:hyperlink w:anchor="__RefHeading___Toc2152_2555388784" w:tooltip="Table 4.6: Objectives and the evidence for each">
+          <w:hyperlink w:anchor="__RefHeading___Toc2152_1190944670" w:tooltip="Table 4.6: Objectives and the evidence for each">
             <w:r>
               <w:rPr>
                 <w:rStyle w:val="IndexLink"/>
@@ -1414,7 +1414,7 @@
             </w:tabs>
             <w:rPr/>
           </w:pPr>
-          <w:hyperlink w:anchor="__RefHeading___Toc2150_2555388784" w:tooltip="Table B.1: Milestones M0–M10 and their verdicts">
+          <w:hyperlink w:anchor="__RefHeading___Toc2150_1190944670" w:tooltip="Table B.1: Milestones M0–M10 and their verdicts">
             <w:r>
               <w:rPr>
                 <w:rStyle w:val="IndexLink"/>
@@ -1447,7 +1447,7 @@
         <w:pStyle w:val="FrontHeading"/>
         <w:rPr/>
       </w:pPr>
-      <w:bookmarkStart w:id="2" w:name="__RefHeading___Toc2078_2555388784"/>
+      <w:bookmarkStart w:id="2" w:name="__RefHeading___Toc2078_1190944670"/>
       <w:bookmarkEnd w:id="2"/>
       <w:r>
         <w:rPr/>
@@ -1486,7 +1486,7 @@
             </w:rPr>
             <w:fldChar w:fldCharType="separate"/>
           </w:r>
-          <w:hyperlink w:anchor="__RefHeading___Toc2178_2555388784" w:tooltip="Figure 1.1: The playable game rendered natively and by live StructRender (watercolour)">
+          <w:hyperlink w:anchor="__RefHeading___Toc2178_1190944670" w:tooltip="Figure 1.1: The playable game rendered natively and by live StructRender (watercolour)">
             <w:r>
               <w:rPr>
                 <w:rStyle w:val="IndexLink"/>
@@ -1506,7 +1506,7 @@
             </w:tabs>
             <w:rPr/>
           </w:pPr>
-          <w:hyperlink w:anchor="__RefHeading___Toc2194_2555388784" w:tooltip="Figure 3.1: System architecture: offline data and supervision, and the runtime loop">
+          <w:hyperlink w:anchor="__RefHeading___Toc2194_1190944670" w:tooltip="Figure 3.1: System architecture: offline data and supervision, and the runtime loop">
             <w:r>
               <w:rPr>
                 <w:rStyle w:val="IndexLink"/>
@@ -1526,7 +1526,7 @@
             </w:tabs>
             <w:rPr/>
           </w:pPr>
-          <w:hyperlink w:anchor="__RefHeading___Toc2192_2555388784" w:tooltip="Figure 3.2: Structural inputs, motion and confidence mask for one test frame">
+          <w:hyperlink w:anchor="__RefHeading___Toc2192_1190944670" w:tooltip="Figure 3.2: Structural inputs, motion and confidence mask for one test frame">
             <w:r>
               <w:rPr>
                 <w:rStyle w:val="IndexLink"/>
@@ -1546,7 +1546,7 @@
             </w:tabs>
             <w:rPr/>
           </w:pPr>
-          <w:hyperlink w:anchor="__RefHeading___Toc2190_2555388784" w:tooltip="Figure 3.3: StyleTemporalUNet: style-free encoder, temporal fusion, FiLM decoder">
+          <w:hyperlink w:anchor="__RefHeading___Toc2190_1190944670" w:tooltip="Figure 3.3: StyleTemporalUNet: style-free encoder, temporal fusion, FiLM decoder">
             <w:r>
               <w:rPr>
                 <w:rStyle w:val="IndexLink"/>
@@ -1566,7 +1566,7 @@
             </w:tabs>
             <w:rPr/>
           </w:pPr>
-          <w:hyperlink w:anchor="__RefHeading___Toc2188_2555388784" w:tooltip="Figure 4.1: Training objective and validation L1/PSNR of the deployed model">
+          <w:hyperlink w:anchor="__RefHeading___Toc2188_1190944670" w:tooltip="Figure 4.1: Training objective and validation L1/PSNR of the deployed model">
             <w:r>
               <w:rPr>
                 <w:rStyle w:val="IndexLink"/>
@@ -1586,7 +1586,7 @@
             </w:tabs>
             <w:rPr/>
           </w:pPr>
-          <w:hyperlink w:anchor="__RefHeading___Toc2186_2555388784" w:tooltip="Figure 4.2: Native input, teacher target and model output for one sealed test frame">
+          <w:hyperlink w:anchor="__RefHeading___Toc2186_1190944670" w:tooltip="Figure 4.2: Native input, teacher target and model output for one sealed test frame">
             <w:r>
               <w:rPr>
                 <w:rStyle w:val="IndexLink"/>
@@ -1606,7 +1606,7 @@
             </w:tabs>
             <w:rPr/>
           </w:pPr>
-          <w:hyperlink w:anchor="__RefHeading___Toc2184_2555388784" w:tooltip="Figure 4.3: Live frame rate of the whole loop, and TensorRT latency alone">
+          <w:hyperlink w:anchor="__RefHeading___Toc2184_1190944670" w:tooltip="Figure 4.3: Live frame rate of the whole loop, and TensorRT latency alone">
             <w:r>
               <w:rPr>
                 <w:rStyle w:val="IndexLink"/>
@@ -1626,7 +1626,7 @@
             </w:tabs>
             <w:rPr/>
           </w:pPr>
-          <w:hyperlink w:anchor="__RefHeading___Toc2182_2555388784" w:tooltip="Figure C.1: Street scene: the original frame (top left) and 16 visual themes">
+          <w:hyperlink w:anchor="__RefHeading___Toc2182_1190944670" w:tooltip="Figure C.1: Street scene: the original frame (top left) and 16 visual themes">
             <w:r>
               <w:rPr>
                 <w:rStyle w:val="IndexLink"/>
@@ -1646,7 +1646,7 @@
             </w:tabs>
             <w:rPr/>
           </w:pPr>
-          <w:hyperlink w:anchor="__RefHeading___Toc2180_2555388784" w:tooltip="Figure C.2: Swinging scene: the original frame (top left) and 16 visual themes">
+          <w:hyperlink w:anchor="__RefHeading___Toc2180_1190944670" w:tooltip="Figure C.2: Swinging scene: the original frame (top left) and 16 visual themes">
             <w:r>
               <w:rPr>
                 <w:rStyle w:val="IndexLink"/>
@@ -1679,7 +1679,7 @@
         <w:pStyle w:val="FrontHeading"/>
         <w:rPr/>
       </w:pPr>
-      <w:bookmarkStart w:id="3" w:name="__RefHeading___Toc2080_2555388784"/>
+      <w:bookmarkStart w:id="3" w:name="__RefHeading___Toc2080_1190944670"/>
       <w:bookmarkEnd w:id="3"/>
       <w:r>
         <w:rPr/>
@@ -2490,7 +2490,7 @@
         <w:pStyle w:val="Heading1"/>
         <w:rPr/>
       </w:pPr>
-      <w:bookmarkStart w:id="4" w:name="__RefHeading___Toc2082_2555388784"/>
+      <w:bookmarkStart w:id="4" w:name="__RefHeading___Toc2082_1190944670"/>
       <w:bookmarkEnd w:id="4"/>
       <w:r>
         <w:rPr/>
@@ -2502,7 +2502,7 @@
         <w:pStyle w:val="Heading2"/>
         <w:rPr/>
       </w:pPr>
-      <w:bookmarkStart w:id="5" w:name="__RefHeading___Toc2084_2555388784"/>
+      <w:bookmarkStart w:id="5" w:name="__RefHeading___Toc2084_1190944670"/>
       <w:bookmarkEnd w:id="5"/>
       <w:r>
         <w:rPr/>
@@ -2606,7 +2606,7 @@
         <w:pStyle w:val="FigureCaption"/>
         <w:rPr/>
       </w:pPr>
-      <w:bookmarkStart w:id="6" w:name="__RefHeading___Toc2178_2555388784"/>
+      <w:bookmarkStart w:id="6" w:name="__RefHeading___Toc2178_1190944670"/>
       <w:bookmarkEnd w:id="6"/>
       <w:r>
         <w:rPr>
@@ -2635,7 +2635,7 @@
         <w:pStyle w:val="Heading2"/>
         <w:rPr/>
       </w:pPr>
-      <w:bookmarkStart w:id="7" w:name="__RefHeading___Toc2086_2555388784"/>
+      <w:bookmarkStart w:id="7" w:name="__RefHeading___Toc2086_1190944670"/>
       <w:bookmarkEnd w:id="7"/>
       <w:r>
         <w:rPr/>
@@ -2698,7 +2698,7 @@
         <w:pStyle w:val="Heading2"/>
         <w:rPr/>
       </w:pPr>
-      <w:bookmarkStart w:id="8" w:name="__RefHeading___Toc2088_2555388784"/>
+      <w:bookmarkStart w:id="8" w:name="__RefHeading___Toc2088_1190944670"/>
       <w:bookmarkEnd w:id="8"/>
       <w:r>
         <w:rPr/>
@@ -2908,7 +2908,7 @@
         <w:pStyle w:val="Heading2"/>
         <w:rPr/>
       </w:pPr>
-      <w:bookmarkStart w:id="9" w:name="__RefHeading___Toc2090_2555388784"/>
+      <w:bookmarkStart w:id="9" w:name="__RefHeading___Toc2090_1190944670"/>
       <w:bookmarkEnd w:id="9"/>
       <w:r>
         <w:rPr/>
@@ -2976,7 +2976,7 @@
         <w:pStyle w:val="Heading1"/>
         <w:rPr/>
       </w:pPr>
-      <w:bookmarkStart w:id="10" w:name="__RefHeading___Toc2092_2555388784"/>
+      <w:bookmarkStart w:id="10" w:name="__RefHeading___Toc2092_1190944670"/>
       <w:bookmarkEnd w:id="10"/>
       <w:r>
         <w:rPr/>
@@ -2988,7 +2988,7 @@
         <w:pStyle w:val="Heading2"/>
         <w:rPr/>
       </w:pPr>
-      <w:bookmarkStart w:id="11" w:name="__RefHeading___Toc2094_2555388784"/>
+      <w:bookmarkStart w:id="11" w:name="__RefHeading___Toc2094_1190944670"/>
       <w:bookmarkEnd w:id="11"/>
       <w:r>
         <w:rPr/>
@@ -3090,7 +3090,7 @@
         <w:pStyle w:val="Heading3"/>
         <w:rPr/>
       </w:pPr>
-      <w:bookmarkStart w:id="12" w:name="__RefHeading___Toc2096_2555388784"/>
+      <w:bookmarkStart w:id="12" w:name="__RefHeading___Toc2096_1190944670"/>
       <w:bookmarkEnd w:id="12"/>
       <w:r>
         <w:rPr/>
@@ -3181,7 +3181,7 @@
         <w:keepNext w:val="true"/>
         <w:rPr/>
       </w:pPr>
-      <w:bookmarkStart w:id="13" w:name="__RefHeading___Toc2148_2555388784"/>
+      <w:bookmarkStart w:id="13" w:name="__RefHeading___Toc2148_1190944670"/>
       <w:bookmarkEnd w:id="13"/>
       <w:r>
         <w:rPr>
@@ -5255,7 +5255,7 @@
         <w:pStyle w:val="Heading2"/>
         <w:rPr/>
       </w:pPr>
-      <w:bookmarkStart w:id="14" w:name="__RefHeading___Toc2098_2555388784"/>
+      <w:bookmarkStart w:id="14" w:name="__RefHeading___Toc2098_1190944670"/>
       <w:bookmarkEnd w:id="14"/>
       <w:r>
         <w:rPr/>
@@ -5278,7 +5278,7 @@
         <w:keepNext w:val="true"/>
         <w:rPr/>
       </w:pPr>
-      <w:bookmarkStart w:id="15" w:name="__RefHeading___Toc2176_2555388784"/>
+      <w:bookmarkStart w:id="15" w:name="__RefHeading___Toc2176_1190944670"/>
       <w:bookmarkEnd w:id="15"/>
       <w:r>
         <w:rPr>
@@ -5938,7 +5938,7 @@
         <w:pStyle w:val="Heading1"/>
         <w:rPr/>
       </w:pPr>
-      <w:bookmarkStart w:id="16" w:name="__RefHeading___Toc2100_2555388784"/>
+      <w:bookmarkStart w:id="16" w:name="__RefHeading___Toc2100_1190944670"/>
       <w:bookmarkEnd w:id="16"/>
       <w:r>
         <w:rPr/>
@@ -5950,7 +5950,7 @@
         <w:pStyle w:val="Heading2"/>
         <w:rPr/>
       </w:pPr>
-      <w:bookmarkStart w:id="17" w:name="__RefHeading___Toc2102_2555388784"/>
+      <w:bookmarkStart w:id="17" w:name="__RefHeading___Toc2102_1190944670"/>
       <w:bookmarkEnd w:id="17"/>
       <w:r>
         <w:rPr/>
@@ -6022,7 +6022,7 @@
         <w:pStyle w:val="FigureCaption"/>
         <w:rPr/>
       </w:pPr>
-      <w:bookmarkStart w:id="18" w:name="__RefHeading___Toc2194_2555388784"/>
+      <w:bookmarkStart w:id="18" w:name="__RefHeading___Toc2194_1190944670"/>
       <w:bookmarkEnd w:id="18"/>
       <w:r>
         <w:rPr>
@@ -6169,7 +6169,7 @@
         <w:pStyle w:val="Heading3"/>
         <w:rPr/>
       </w:pPr>
-      <w:bookmarkStart w:id="19" w:name="__RefHeading___Toc2104_2555388784"/>
+      <w:bookmarkStart w:id="19" w:name="__RefHeading___Toc2104_1190944670"/>
       <w:bookmarkEnd w:id="19"/>
       <w:r>
         <w:rPr/>
@@ -6214,7 +6214,7 @@
         <w:keepNext w:val="true"/>
         <w:rPr/>
       </w:pPr>
-      <w:bookmarkStart w:id="20" w:name="__RefHeading___Toc2174_2555388784"/>
+      <w:bookmarkStart w:id="20" w:name="__RefHeading___Toc2174_1190944670"/>
       <w:bookmarkEnd w:id="20"/>
       <w:r>
         <w:rPr>
@@ -7164,7 +7164,7 @@
         <w:pStyle w:val="Heading3"/>
         <w:rPr/>
       </w:pPr>
-      <w:bookmarkStart w:id="21" w:name="__RefHeading___Toc2106_2555388784"/>
+      <w:bookmarkStart w:id="21" w:name="__RefHeading___Toc2106_1190944670"/>
       <w:bookmarkEnd w:id="21"/>
       <w:r>
         <w:rPr/>
@@ -7211,7 +7211,7 @@
         <w:keepNext w:val="true"/>
         <w:rPr/>
       </w:pPr>
-      <w:bookmarkStart w:id="22" w:name="__RefHeading___Toc2172_2555388784"/>
+      <w:bookmarkStart w:id="22" w:name="__RefHeading___Toc2172_1190944670"/>
       <w:bookmarkEnd w:id="22"/>
       <w:r>
         <w:rPr>
@@ -7717,7 +7717,7 @@
         <w:keepNext w:val="true"/>
         <w:rPr/>
       </w:pPr>
-      <w:bookmarkStart w:id="23" w:name="__RefHeading___Toc2170_2555388784"/>
+      <w:bookmarkStart w:id="23" w:name="__RefHeading___Toc2170_1190944670"/>
       <w:bookmarkEnd w:id="23"/>
       <w:r>
         <w:rPr>
@@ -8602,7 +8602,7 @@
         <w:pStyle w:val="FigureCaption"/>
         <w:rPr/>
       </w:pPr>
-      <w:bookmarkStart w:id="24" w:name="__RefHeading___Toc2192_2555388784"/>
+      <w:bookmarkStart w:id="24" w:name="__RefHeading___Toc2192_1190944670"/>
       <w:bookmarkEnd w:id="24"/>
       <w:r>
         <w:rPr>
@@ -8621,7 +8621,7 @@
         <w:pStyle w:val="Heading3"/>
         <w:rPr/>
       </w:pPr>
-      <w:bookmarkStart w:id="25" w:name="__RefHeading___Toc2108_2555388784"/>
+      <w:bookmarkStart w:id="25" w:name="__RefHeading___Toc2108_1190944670"/>
       <w:bookmarkEnd w:id="25"/>
       <w:r>
         <w:rPr/>
@@ -8711,7 +8711,7 @@
         <w:pStyle w:val="FigureCaption"/>
         <w:rPr/>
       </w:pPr>
-      <w:bookmarkStart w:id="26" w:name="__RefHeading___Toc2190_2555388784"/>
+      <w:bookmarkStart w:id="26" w:name="__RefHeading___Toc2190_1190944670"/>
       <w:bookmarkEnd w:id="26"/>
       <w:r>
         <w:rPr>
@@ -8987,7 +8987,7 @@
         <w:keepNext w:val="true"/>
         <w:rPr/>
       </w:pPr>
-      <w:bookmarkStart w:id="27" w:name="__RefHeading___Toc2168_2555388784"/>
+      <w:bookmarkStart w:id="27" w:name="__RefHeading___Toc2168_1190944670"/>
       <w:bookmarkEnd w:id="27"/>
       <w:r>
         <w:rPr>
@@ -9953,7 +9953,7 @@
         <w:pStyle w:val="Heading2"/>
         <w:rPr/>
       </w:pPr>
-      <w:bookmarkStart w:id="28" w:name="__RefHeading___Toc2110_2555388784"/>
+      <w:bookmarkStart w:id="28" w:name="__RefHeading___Toc2110_1190944670"/>
       <w:bookmarkEnd w:id="28"/>
       <w:r>
         <w:rPr/>
@@ -9976,7 +9976,7 @@
         <w:keepNext w:val="true"/>
         <w:rPr/>
       </w:pPr>
-      <w:bookmarkStart w:id="29" w:name="__RefHeading___Toc2166_2555388784"/>
+      <w:bookmarkStart w:id="29" w:name="__RefHeading___Toc2166_1190944670"/>
       <w:bookmarkEnd w:id="29"/>
       <w:r>
         <w:rPr>
@@ -10453,7 +10453,7 @@
         <w:pStyle w:val="Heading2"/>
         <w:rPr/>
       </w:pPr>
-      <w:bookmarkStart w:id="30" w:name="__RefHeading___Toc2112_2555388784"/>
+      <w:bookmarkStart w:id="30" w:name="__RefHeading___Toc2112_1190944670"/>
       <w:bookmarkEnd w:id="30"/>
       <w:r>
         <w:rPr/>
@@ -10466,7 +10466,7 @@
         <w:keepNext w:val="true"/>
         <w:rPr/>
       </w:pPr>
-      <w:bookmarkStart w:id="31" w:name="__RefHeading___Toc2164_2555388784"/>
+      <w:bookmarkStart w:id="31" w:name="__RefHeading___Toc2164_1190944670"/>
       <w:bookmarkEnd w:id="31"/>
       <w:r>
         <w:rPr>
@@ -11136,7 +11136,7 @@
         <w:pStyle w:val="Heading1"/>
         <w:rPr/>
       </w:pPr>
-      <w:bookmarkStart w:id="32" w:name="__RefHeading___Toc2114_2555388784"/>
+      <w:bookmarkStart w:id="32" w:name="__RefHeading___Toc2114_1190944670"/>
       <w:bookmarkEnd w:id="32"/>
       <w:r>
         <w:rPr/>
@@ -11148,7 +11148,7 @@
         <w:pStyle w:val="Heading2"/>
         <w:rPr/>
       </w:pPr>
-      <w:bookmarkStart w:id="33" w:name="__RefHeading___Toc2116_2555388784"/>
+      <w:bookmarkStart w:id="33" w:name="__RefHeading___Toc2116_1190944670"/>
       <w:bookmarkEnd w:id="33"/>
       <w:r>
         <w:rPr/>
@@ -11183,7 +11183,7 @@
         <w:keepNext w:val="true"/>
         <w:rPr/>
       </w:pPr>
-      <w:bookmarkStart w:id="34" w:name="__RefHeading___Toc2162_2555388784"/>
+      <w:bookmarkStart w:id="34" w:name="__RefHeading___Toc2162_1190944670"/>
       <w:bookmarkEnd w:id="34"/>
       <w:r>
         <w:rPr>
@@ -11843,7 +11843,7 @@
         <w:pStyle w:val="Heading2"/>
         <w:rPr/>
       </w:pPr>
-      <w:bookmarkStart w:id="35" w:name="__RefHeading___Toc2118_2555388784"/>
+      <w:bookmarkStart w:id="35" w:name="__RefHeading___Toc2118_1190944670"/>
       <w:bookmarkEnd w:id="35"/>
       <w:r>
         <w:rPr/>
@@ -12539,7 +12539,7 @@
         <w:pStyle w:val="Heading2"/>
         <w:rPr/>
       </w:pPr>
-      <w:bookmarkStart w:id="36" w:name="__RefHeading___Toc2120_2555388784"/>
+      <w:bookmarkStart w:id="36" w:name="__RefHeading___Toc2120_1190944670"/>
       <w:bookmarkEnd w:id="36"/>
       <w:r>
         <w:rPr/>
@@ -12551,7 +12551,7 @@
         <w:pStyle w:val="Heading3"/>
         <w:rPr/>
       </w:pPr>
-      <w:bookmarkStart w:id="37" w:name="__RefHeading___Toc2122_2555388784"/>
+      <w:bookmarkStart w:id="37" w:name="__RefHeading___Toc2122_1190944670"/>
       <w:bookmarkEnd w:id="37"/>
       <w:r>
         <w:rPr/>
@@ -12623,7 +12623,7 @@
         <w:pStyle w:val="FigureCaption"/>
         <w:rPr/>
       </w:pPr>
-      <w:bookmarkStart w:id="38" w:name="__RefHeading___Toc2188_2555388784"/>
+      <w:bookmarkStart w:id="38" w:name="__RefHeading___Toc2188_1190944670"/>
       <w:bookmarkEnd w:id="38"/>
       <w:r>
         <w:rPr>
@@ -12642,7 +12642,7 @@
         <w:pStyle w:val="Heading3"/>
         <w:rPr/>
       </w:pPr>
-      <w:bookmarkStart w:id="39" w:name="__RefHeading___Toc2124_2555388784"/>
+      <w:bookmarkStart w:id="39" w:name="__RefHeading___Toc2124_1190944670"/>
       <w:bookmarkEnd w:id="39"/>
       <w:r>
         <w:rPr/>
@@ -12665,7 +12665,7 @@
         <w:keepNext w:val="true"/>
         <w:rPr/>
       </w:pPr>
-      <w:bookmarkStart w:id="40" w:name="__RefHeading___Toc2160_2555388784"/>
+      <w:bookmarkStart w:id="40" w:name="__RefHeading___Toc2160_1190944670"/>
       <w:bookmarkEnd w:id="40"/>
       <w:r>
         <w:rPr>
@@ -14361,7 +14361,7 @@
         <w:pStyle w:val="Heading3"/>
         <w:rPr/>
       </w:pPr>
-      <w:bookmarkStart w:id="41" w:name="__RefHeading___Toc2126_2555388784"/>
+      <w:bookmarkStart w:id="41" w:name="__RefHeading___Toc2126_1190944670"/>
       <w:bookmarkEnd w:id="41"/>
       <w:r>
         <w:rPr/>
@@ -14374,7 +14374,7 @@
         <w:keepNext w:val="true"/>
         <w:rPr/>
       </w:pPr>
-      <w:bookmarkStart w:id="42" w:name="__RefHeading___Toc2158_2555388784"/>
+      <w:bookmarkStart w:id="42" w:name="__RefHeading___Toc2158_1190944670"/>
       <w:bookmarkEnd w:id="42"/>
       <w:r>
         <w:rPr>
@@ -15478,7 +15478,7 @@
         <w:pStyle w:val="FigureCaption"/>
         <w:rPr/>
       </w:pPr>
-      <w:bookmarkStart w:id="43" w:name="__RefHeading___Toc2186_2555388784"/>
+      <w:bookmarkStart w:id="43" w:name="__RefHeading___Toc2186_1190944670"/>
       <w:bookmarkEnd w:id="43"/>
       <w:r>
         <w:rPr>
@@ -15514,7 +15514,7 @@
         <w:pStyle w:val="Heading3"/>
         <w:rPr/>
       </w:pPr>
-      <w:bookmarkStart w:id="44" w:name="__RefHeading___Toc2128_2555388784"/>
+      <w:bookmarkStart w:id="44" w:name="__RefHeading___Toc2128_1190944670"/>
       <w:bookmarkEnd w:id="44"/>
       <w:r>
         <w:rPr/>
@@ -15537,7 +15537,7 @@
         <w:keepNext w:val="true"/>
         <w:rPr/>
       </w:pPr>
-      <w:bookmarkStart w:id="45" w:name="__RefHeading___Toc2156_2555388784"/>
+      <w:bookmarkStart w:id="45" w:name="__RefHeading___Toc2156_1190944670"/>
       <w:bookmarkEnd w:id="45"/>
       <w:r>
         <w:rPr>
@@ -16051,7 +16051,7 @@
         <w:pStyle w:val="FigureCaption"/>
         <w:rPr/>
       </w:pPr>
-      <w:bookmarkStart w:id="46" w:name="__RefHeading___Toc2184_2555388784"/>
+      <w:bookmarkStart w:id="46" w:name="__RefHeading___Toc2184_1190944670"/>
       <w:bookmarkEnd w:id="46"/>
       <w:r>
         <w:rPr>
@@ -16071,7 +16071,7 @@
         <w:keepNext w:val="true"/>
         <w:rPr/>
       </w:pPr>
-      <w:bookmarkStart w:id="47" w:name="__RefHeading___Toc2154_2555388784"/>
+      <w:bookmarkStart w:id="47" w:name="__RefHeading___Toc2154_1190944670"/>
       <w:bookmarkEnd w:id="47"/>
       <w:r>
         <w:rPr>
@@ -16580,7 +16580,7 @@
         <w:pStyle w:val="Heading3"/>
         <w:rPr/>
       </w:pPr>
-      <w:bookmarkStart w:id="48" w:name="__RefHeading___Toc2130_2555388784"/>
+      <w:bookmarkStart w:id="48" w:name="__RefHeading___Toc2130_1190944670"/>
       <w:bookmarkEnd w:id="48"/>
       <w:r>
         <w:rPr/>
@@ -16593,7 +16593,7 @@
         <w:keepNext w:val="true"/>
         <w:rPr/>
       </w:pPr>
-      <w:bookmarkStart w:id="49" w:name="__RefHeading___Toc2152_2555388784"/>
+      <w:bookmarkStart w:id="49" w:name="__RefHeading___Toc2152_1190944670"/>
       <w:bookmarkEnd w:id="49"/>
       <w:r>
         <w:rPr>
@@ -17449,7 +17449,7 @@
         <w:pStyle w:val="Heading1"/>
         <w:rPr/>
       </w:pPr>
-      <w:bookmarkStart w:id="50" w:name="__RefHeading___Toc2132_2555388784"/>
+      <w:bookmarkStart w:id="50" w:name="__RefHeading___Toc2132_1190944670"/>
       <w:bookmarkEnd w:id="50"/>
       <w:r>
         <w:rPr/>
@@ -17461,7 +17461,7 @@
         <w:pStyle w:val="Heading2"/>
         <w:rPr/>
       </w:pPr>
-      <w:bookmarkStart w:id="51" w:name="__RefHeading___Toc2134_2555388784"/>
+      <w:bookmarkStart w:id="51" w:name="__RefHeading___Toc2134_1190944670"/>
       <w:bookmarkEnd w:id="51"/>
       <w:r>
         <w:rPr/>
@@ -17578,7 +17578,7 @@
         <w:pStyle w:val="Heading2"/>
         <w:rPr/>
       </w:pPr>
-      <w:bookmarkStart w:id="52" w:name="__RefHeading___Toc2136_2555388784"/>
+      <w:bookmarkStart w:id="52" w:name="__RefHeading___Toc2136_1190944670"/>
       <w:bookmarkEnd w:id="52"/>
       <w:r>
         <w:rPr/>
@@ -17674,7 +17674,7 @@
         <w:pStyle w:val="BackHeading"/>
         <w:rPr/>
       </w:pPr>
-      <w:bookmarkStart w:id="53" w:name="__RefHeading___Toc2138_2555388784"/>
+      <w:bookmarkStart w:id="53" w:name="__RefHeading___Toc2138_1190944670"/>
       <w:bookmarkEnd w:id="53"/>
       <w:r>
         <w:rPr/>
@@ -18262,7 +18262,7 @@
         <w:pStyle w:val="BackHeading"/>
         <w:rPr/>
       </w:pPr>
-      <w:bookmarkStart w:id="54" w:name="__RefHeading___Toc2140_2555388784"/>
+      <w:bookmarkStart w:id="54" w:name="__RefHeading___Toc2140_1190944670"/>
       <w:bookmarkEnd w:id="54"/>
       <w:r>
         <w:rPr/>
@@ -18274,7 +18274,7 @@
         <w:pStyle w:val="Heading2"/>
         <w:rPr/>
       </w:pPr>
-      <w:bookmarkStart w:id="55" w:name="__RefHeading___Toc2142_2555388784"/>
+      <w:bookmarkStart w:id="55" w:name="__RefHeading___Toc2142_1190944670"/>
       <w:bookmarkEnd w:id="55"/>
       <w:r>
         <w:rPr/>
@@ -18523,7 +18523,7 @@
         <w:pStyle w:val="Heading2"/>
         <w:rPr/>
       </w:pPr>
-      <w:bookmarkStart w:id="56" w:name="__RefHeading___Toc2144_2555388784"/>
+      <w:bookmarkStart w:id="56" w:name="__RefHeading___Toc2144_1190944670"/>
       <w:bookmarkEnd w:id="56"/>
       <w:r>
         <w:rPr/>
@@ -18536,7 +18536,7 @@
         <w:keepNext w:val="true"/>
         <w:rPr/>
       </w:pPr>
-      <w:bookmarkStart w:id="57" w:name="__RefHeading___Toc2150_2555388784"/>
+      <w:bookmarkStart w:id="57" w:name="__RefHeading___Toc2150_1190944670"/>
       <w:bookmarkEnd w:id="57"/>
       <w:r>
         <w:rPr>
@@ -19298,7 +19298,7 @@
         <w:pStyle w:val="Heading2"/>
         <w:rPr/>
       </w:pPr>
-      <w:bookmarkStart w:id="58" w:name="__RefHeading___Toc2146_2555388784"/>
+      <w:bookmarkStart w:id="58" w:name="__RefHeading___Toc2146_1190944670"/>
       <w:bookmarkEnd w:id="58"/>
       <w:r>
         <w:rPr/>
@@ -19312,7 +19312,7 @@
       </w:pPr>
       <w:r>
         <w:rPr/>
-        <w:t xml:space="preserve">Figures C.1 and C.2 are collages of the screenshots in </w:t>
+        <w:t xml:space="preserve">Figures C.1 and C.2 show screenshots of https://structrender.vercel.app/, a separate project: a Spider-Man web-swinging game for the browser (Three.js), and an unofficial fan project not affiliated with Marvel, Disney, Sony or Insomniac Games. Its 16 themes are drawn by its own rendering pipeline, not by the StructRender model of Chapter 4. The originals are in </w:t>
       </w:r>
       <w:r>
         <w:rPr>
@@ -19324,7 +19324,7 @@
       </w:r>
       <w:r>
         <w:rPr/>
-        <w:t>: one original frame and 16 visual themes, each shown for a street scene and a swinging scene. The scene is not the StructRender Godot game, and the themed images are not outputs of the StructRender model evaluated in Chapter 4, which renders only the oil and watercolour styles. Source of the screenshots and the method used to produce the themes: [DETAILS REQUIRED].</w:t>
+        <w:t>.</w:t>
       </w:r>
     </w:p>
     <w:p>
@@ -19382,7 +19382,7 @@
         <w:pStyle w:val="FigureCaption"/>
         <w:rPr/>
       </w:pPr>
-      <w:bookmarkStart w:id="59" w:name="__RefHeading___Toc2182_2555388784"/>
+      <w:bookmarkStart w:id="59" w:name="__RefHeading___Toc2182_1190944670"/>
       <w:bookmarkEnd w:id="59"/>
       <w:r>
         <w:rPr>
@@ -19453,7 +19453,7 @@
         <w:jc w:val="center"/>
         <w:rPr/>
       </w:pPr>
-      <w:bookmarkStart w:id="60" w:name="__RefHeading___Toc2180_2555388784"/>
+      <w:bookmarkStart w:id="60" w:name="__RefHeading___Toc2180_1190944670"/>
       <w:bookmarkEnd w:id="60"/>
       <w:r>
         <w:rPr>

</xml_diff>

<commit_message>
Lab report: SRIHER template title pages, Bonafide certificate, and Times New Roman throughout
Cover and inner title page follow the SRIHER project-report template (logo, course, students,
degree, November 2026); the Bonafide certificate names Dr. V. Vanitha as supervisor. Laptop
model filled in. The export step now sets every font in the saved .docx to Times New Roman.

Co-Authored-By: Claude Opus 5.5 <noreply@anthropic.com>
Claude-Session: https://claude.ai/code/session_017tCN9U8Bqx9WnkpxSeFvHJ
</commit_message>
<xml_diff>
--- a/docs/lab_report/StructRender_Lab_Report.docx
+++ b/docs/lab_report/StructRender_Lab_Report.docx
@@ -5,119 +5,140 @@
     <w:p>
       <w:pPr>
         <w:pStyle w:val="Normal"/>
-        <w:spacing w:before="600" w:after="80"/>
+        <w:spacing w:lineRule="auto" w:line="360" w:before="0" w:after="240"/>
         <w:jc w:val="center"/>
         <w:rPr/>
       </w:pPr>
       <w:r>
-        <w:rPr>
-          <w:rFonts w:eastAsia="Times New Roman" w:cs="Times New Roman"/>
+        <w:rPr/>
+        <w:drawing>
+          <wp:inline distT="0" distB="0" distL="0" distR="0">
+            <wp:extent cx="5734050" cy="1143000"/>
+            <wp:effectExtent l="0" t="0" r="0" b="0"/>
+            <wp:docPr id="1" name="sriher_logo" descr="SRIHER logo&#10;Sri Ramachandra Institute of Higher Education and Research"/>
+            <wp:cNvGraphicFramePr>
+              <a:graphicFrameLocks xmlns:a="http://schemas.openxmlformats.org/drawingml/2006/main" noChangeAspect="1"/>
+            </wp:cNvGraphicFramePr>
+            <a:graphic xmlns:a="http://schemas.openxmlformats.org/drawingml/2006/main">
+              <a:graphicData uri="http://schemas.openxmlformats.org/drawingml/2006/picture">
+                <pic:pic xmlns:pic="http://schemas.openxmlformats.org/drawingml/2006/picture">
+                  <pic:nvPicPr>
+                    <pic:cNvPr id="1" name="sriher_logo" descr="SRIHER logo&#10;Sri Ramachandra Institute of Higher Education and Research"/>
+                    <pic:cNvPicPr>
+                      <a:picLocks noChangeAspect="1" noChangeArrowheads="1"/>
+                    </pic:cNvPicPr>
+                  </pic:nvPicPr>
+                  <pic:blipFill>
+                    <a:blip r:embed="rId2"/>
+                    <a:stretch>
+                      <a:fillRect/>
+                    </a:stretch>
+                  </pic:blipFill>
+                  <pic:spPr bwMode="auto">
+                    <a:xfrm>
+                      <a:off x="0" y="0"/>
+                      <a:ext cx="5734050" cy="1143000"/>
+                    </a:xfrm>
+                    <a:prstGeom prst="rect">
+                      <a:avLst/>
+                    </a:prstGeom>
+                    <a:noFill/>
+                  </pic:spPr>
+                </pic:pic>
+              </a:graphicData>
+            </a:graphic>
+          </wp:inline>
+        </w:drawing>
+      </w:r>
+    </w:p>
+    <w:p>
+      <w:pPr>
+        <w:pStyle w:val="Normal"/>
+        <w:spacing w:lineRule="auto" w:line="360" w:before="0" w:after="160"/>
+        <w:jc w:val="center"/>
+        <w:rPr/>
+      </w:pPr>
+      <w:r>
+        <w:rPr/>
+      </w:r>
+    </w:p>
+    <w:p>
+      <w:pPr>
+        <w:pStyle w:val="Normal"/>
+        <w:spacing w:lineRule="auto" w:line="360" w:before="0" w:after="240"/>
+        <w:jc w:val="center"/>
+        <w:rPr/>
+      </w:pPr>
+      <w:r>
+        <w:rPr>
+          <w:rFonts w:ascii="Times New Roman" w:hAnsi="Times New Roman" w:cs="Times New Roman" w:eastAsia="Times New Roman"/>
+          <w:b/>
+          <w:bCs/>
+          <w:sz w:val="32"/>
+          <w:szCs w:val="32"/>
+        </w:rPr>
+        <w:t>StructRender: Engine-Grounded Real-Time Neural Rendering of a Game in Learned Painterly Styles</w:t>
+      </w:r>
+    </w:p>
+    <w:p>
+      <w:pPr>
+        <w:pStyle w:val="Normal"/>
+        <w:spacing w:lineRule="auto" w:line="360" w:before="0" w:after="160"/>
+        <w:jc w:val="center"/>
+        <w:rPr/>
+      </w:pPr>
+      <w:r>
+        <w:rPr>
+          <w:rFonts w:ascii="Times New Roman" w:hAnsi="Times New Roman" w:cs="Times New Roman" w:eastAsia="Times New Roman"/>
           <w:b/>
           <w:bCs/>
           <w:sz w:val="28"/>
           <w:szCs w:val="28"/>
         </w:rPr>
-        <w:t>[DETAILS REQUIRED] — Name of the University / Institute</w:t>
+        <w:t>ADA23DLU06 - RECENT TRENDS IN DEEP LEARNING LABORATORY</w:t>
       </w:r>
     </w:p>
     <w:p>
       <w:pPr>
         <w:pStyle w:val="Normal"/>
-        <w:spacing w:lineRule="auto" w:line="300" w:before="0" w:after="120"/>
+        <w:spacing w:lineRule="auto" w:line="360" w:before="0" w:after="160"/>
         <w:jc w:val="center"/>
         <w:rPr/>
       </w:pPr>
       <w:r>
         <w:rPr>
-          <w:rFonts w:eastAsia="Times New Roman" w:cs="Times New Roman"/>
+          <w:rFonts w:ascii="Times New Roman" w:hAnsi="Times New Roman" w:cs="Times New Roman" w:eastAsia="Times New Roman"/>
+          <w:b/>
+          <w:bCs/>
           <w:sz w:val="24"/>
           <w:szCs w:val="24"/>
         </w:rPr>
-        <w:t>[DETAILS REQUIRED] — Department</w:t>
+        <w:t>PROJECT REPORT</w:t>
       </w:r>
     </w:p>
     <w:p>
       <w:pPr>
         <w:pStyle w:val="Normal"/>
-        <w:spacing w:before="900" w:after="240"/>
+        <w:spacing w:lineRule="auto" w:line="360" w:before="0" w:after="160"/>
         <w:jc w:val="center"/>
         <w:rPr/>
       </w:pPr>
       <w:r>
-        <w:rPr>
-          <w:rFonts w:eastAsia="Times New Roman" w:cs="Times New Roman"/>
+        <w:rPr/>
+      </w:r>
+    </w:p>
+    <w:p>
+      <w:pPr>
+        <w:pStyle w:val="Normal"/>
+        <w:spacing w:lineRule="auto" w:line="360" w:before="0" w:after="160"/>
+        <w:jc w:val="center"/>
+        <w:rPr/>
+      </w:pPr>
+      <w:r>
+        <w:rPr>
+          <w:rFonts w:ascii="Times New Roman" w:hAnsi="Times New Roman" w:cs="Times New Roman" w:eastAsia="Times New Roman"/>
           <w:b/>
           <w:bCs/>
-          <w:sz w:val="26"/>
-          <w:szCs w:val="26"/>
-        </w:rPr>
-        <w:t>LABORATORY PROJECT REPORT</w:t>
-      </w:r>
-    </w:p>
-    <w:p>
-      <w:pPr>
-        <w:pStyle w:val="Normal"/>
-        <w:spacing w:before="0" w:after="60"/>
-        <w:jc w:val="center"/>
-        <w:rPr/>
-      </w:pPr>
-      <w:r>
-        <w:rPr>
-          <w:rFonts w:eastAsia="Times New Roman" w:cs="Times New Roman"/>
-          <w:b/>
-          <w:bCs/>
-          <w:sz w:val="36"/>
-          <w:szCs w:val="36"/>
-        </w:rPr>
-        <w:t>StructRender: Engine-Grounded Real-Time</w:t>
-      </w:r>
-    </w:p>
-    <w:p>
-      <w:pPr>
-        <w:pStyle w:val="Normal"/>
-        <w:spacing w:before="0" w:after="60"/>
-        <w:jc w:val="center"/>
-        <w:rPr/>
-      </w:pPr>
-      <w:r>
-        <w:rPr>
-          <w:rFonts w:eastAsia="Times New Roman" w:cs="Times New Roman"/>
-          <w:b/>
-          <w:bCs/>
-          <w:sz w:val="36"/>
-          <w:szCs w:val="36"/>
-        </w:rPr>
-        <w:t>Neural Rendering of a Game</w:t>
-      </w:r>
-    </w:p>
-    <w:p>
-      <w:pPr>
-        <w:pStyle w:val="Normal"/>
-        <w:spacing w:before="0" w:after="600"/>
-        <w:jc w:val="center"/>
-        <w:rPr/>
-      </w:pPr>
-      <w:r>
-        <w:rPr>
-          <w:rFonts w:eastAsia="Times New Roman" w:cs="Times New Roman"/>
-          <w:b/>
-          <w:bCs/>
-          <w:sz w:val="36"/>
-          <w:szCs w:val="36"/>
-        </w:rPr>
-        <w:t>in Learned Painterly Styles</w:t>
-      </w:r>
-    </w:p>
-    <w:p>
-      <w:pPr>
-        <w:pStyle w:val="Normal"/>
-        <w:spacing w:lineRule="auto" w:line="300" w:before="0" w:after="120"/>
-        <w:jc w:val="center"/>
-        <w:rPr/>
-      </w:pPr>
-      <w:r>
-        <w:rPr>
-          <w:rFonts w:eastAsia="Times New Roman" w:cs="Times New Roman"/>
           <w:i/>
           <w:iCs/>
           <w:sz w:val="24"/>
@@ -129,74 +150,860 @@
     <w:p>
       <w:pPr>
         <w:pStyle w:val="Normal"/>
-        <w:spacing w:lineRule="auto" w:line="300" w:before="0" w:after="120"/>
+        <w:spacing w:lineRule="auto" w:line="360" w:before="0" w:after="160"/>
         <w:jc w:val="center"/>
         <w:rPr/>
       </w:pPr>
       <w:r>
         <w:rPr>
-          <w:rFonts w:eastAsia="Times New Roman" w:cs="Times New Roman"/>
+          <w:rFonts w:ascii="Times New Roman" w:hAnsi="Times New Roman" w:cs="Times New Roman" w:eastAsia="Times New Roman"/>
           <w:b/>
           <w:bCs/>
-          <w:sz w:val="26"/>
-          <w:szCs w:val="26"/>
-        </w:rPr>
-        <w:t>[DETAILS REQUIRED] — Student name(s)</w:t>
+          <w:sz w:val="28"/>
+          <w:szCs w:val="28"/>
+        </w:rPr>
+        <w:t>KABILASH.S-E0323036</w:t>
       </w:r>
     </w:p>
     <w:p>
       <w:pPr>
         <w:pStyle w:val="Normal"/>
-        <w:spacing w:before="0" w:after="400"/>
+        <w:spacing w:lineRule="auto" w:line="360" w:before="0" w:after="160"/>
         <w:jc w:val="center"/>
         <w:rPr/>
       </w:pPr>
       <w:r>
         <w:rPr>
-          <w:rFonts w:eastAsia="Times New Roman" w:cs="Times New Roman"/>
+          <w:rFonts w:ascii="Times New Roman" w:hAnsi="Times New Roman" w:cs="Times New Roman" w:eastAsia="Times New Roman"/>
+          <w:b/>
+          <w:bCs/>
+          <w:sz w:val="28"/>
+          <w:szCs w:val="28"/>
+        </w:rPr>
+        <w:t>PAVITRA.P-E0323038</w:t>
+      </w:r>
+    </w:p>
+    <w:p>
+      <w:pPr>
+        <w:pStyle w:val="Normal"/>
+        <w:spacing w:lineRule="auto" w:line="360" w:before="0" w:after="160"/>
+        <w:jc w:val="center"/>
+        <w:rPr/>
+      </w:pPr>
+      <w:r>
+        <w:rPr/>
+      </w:r>
+    </w:p>
+    <w:p>
+      <w:pPr>
+        <w:pStyle w:val="Normal"/>
+        <w:spacing w:lineRule="auto" w:line="360" w:before="0" w:after="160"/>
+        <w:jc w:val="center"/>
+        <w:rPr/>
+      </w:pPr>
+      <w:r>
+        <w:rPr>
+          <w:rFonts w:ascii="Times New Roman" w:hAnsi="Times New Roman" w:cs="Times New Roman" w:eastAsia="Times New Roman"/>
+          <w:b/>
+          <w:bCs/>
+          <w:i/>
+          <w:iCs/>
           <w:sz w:val="24"/>
           <w:szCs w:val="24"/>
         </w:rPr>
-        <w:t>Register number: [DETAILS REQUIRED]</w:t>
+        <w:t>In partial fulfilment for the award of the degree of</w:t>
       </w:r>
     </w:p>
     <w:p>
       <w:pPr>
         <w:pStyle w:val="Normal"/>
-        <w:spacing w:lineRule="auto" w:line="300" w:before="0" w:after="120"/>
+        <w:spacing w:lineRule="auto" w:line="360" w:before="0" w:after="160"/>
         <w:jc w:val="center"/>
         <w:rPr/>
       </w:pPr>
       <w:r>
         <w:rPr>
-          <w:rFonts w:eastAsia="Times New Roman" w:cs="Times New Roman"/>
+          <w:rFonts w:ascii="Times New Roman" w:hAnsi="Times New Roman" w:cs="Times New Roman" w:eastAsia="Times New Roman"/>
+          <w:b/>
+          <w:bCs/>
           <w:sz w:val="24"/>
           <w:szCs w:val="24"/>
         </w:rPr>
-        <w:t>Course: [DETAILS REQUIRED]</w:t>
+        <w:t>BACHELOR OF TECHNOLOGY</w:t>
       </w:r>
     </w:p>
     <w:p>
       <w:pPr>
         <w:pStyle w:val="Normal"/>
-        <w:spacing w:before="0" w:after="900"/>
+        <w:spacing w:lineRule="auto" w:line="360" w:before="0" w:after="160"/>
         <w:jc w:val="center"/>
         <w:rPr/>
       </w:pPr>
       <w:r>
         <w:rPr>
-          <w:rFonts w:eastAsia="Times New Roman" w:cs="Times New Roman"/>
+          <w:rFonts w:ascii="Times New Roman" w:hAnsi="Times New Roman" w:cs="Times New Roman" w:eastAsia="Times New Roman"/>
+          <w:b/>
+          <w:bCs/>
           <w:sz w:val="24"/>
           <w:szCs w:val="24"/>
         </w:rPr>
-        <w:t>Under the guidance of [DETAILS REQUIRED] — Supervisor name and designation</w:t>
+        <w:t>in</w:t>
       </w:r>
     </w:p>
     <w:p>
       <w:pPr>
         <w:pStyle w:val="Normal"/>
-        <w:spacing w:lineRule="auto" w:line="300" w:before="0" w:after="120"/>
+        <w:spacing w:lineRule="auto" w:line="360" w:before="0" w:after="160"/>
         <w:jc w:val="center"/>
+        <w:rPr/>
+      </w:pPr>
+      <w:r>
+        <w:rPr>
+          <w:rFonts w:ascii="Times New Roman" w:hAnsi="Times New Roman" w:cs="Times New Roman" w:eastAsia="Times New Roman"/>
+          <w:b/>
+          <w:bCs/>
+          <w:sz w:val="24"/>
+          <w:szCs w:val="24"/>
+        </w:rPr>
+        <w:t>COMPUTER SCIENCE AND ENGINEERING</w:t>
+      </w:r>
+    </w:p>
+    <w:p>
+      <w:pPr>
+        <w:pStyle w:val="Normal"/>
+        <w:spacing w:lineRule="auto" w:line="360" w:before="0" w:after="160"/>
+        <w:jc w:val="center"/>
+        <w:rPr/>
+      </w:pPr>
+      <w:r>
+        <w:rPr>
+          <w:rFonts w:ascii="Times New Roman" w:hAnsi="Times New Roman" w:cs="Times New Roman" w:eastAsia="Times New Roman"/>
+          <w:b/>
+          <w:bCs/>
+          <w:sz w:val="24"/>
+          <w:szCs w:val="24"/>
+        </w:rPr>
+        <w:t>(Artificial Intelligence and Data Analytics)</w:t>
+      </w:r>
+    </w:p>
+    <w:p>
+      <w:pPr>
+        <w:pStyle w:val="Normal"/>
+        <w:spacing w:lineRule="auto" w:line="360" w:before="0" w:after="160"/>
+        <w:jc w:val="center"/>
+        <w:rPr/>
+      </w:pPr>
+      <w:r>
+        <w:rPr>
+          <w:rFonts w:ascii="Times New Roman" w:hAnsi="Times New Roman" w:cs="Times New Roman" w:eastAsia="Times New Roman"/>
+          <w:b/>
+          <w:bCs/>
+          <w:sz w:val="24"/>
+          <w:szCs w:val="24"/>
+        </w:rPr>
+        <w:t>Sri Ramachandra Faculty of Engineering and Technology</w:t>
+      </w:r>
+    </w:p>
+    <w:p>
+      <w:pPr>
+        <w:pStyle w:val="Normal"/>
+        <w:spacing w:lineRule="auto" w:line="360" w:before="0" w:after="160"/>
+        <w:jc w:val="center"/>
+        <w:rPr/>
+      </w:pPr>
+      <w:r>
+        <w:rPr>
+          <w:rFonts w:ascii="Times New Roman" w:hAnsi="Times New Roman" w:cs="Times New Roman" w:eastAsia="Times New Roman"/>
+          <w:b/>
+          <w:bCs/>
+          <w:sz w:val="24"/>
+          <w:szCs w:val="24"/>
+        </w:rPr>
+        <w:t>Sri Ramachandra Institute of Higher Education and Research, Porur, Chennai -600116</w:t>
+      </w:r>
+    </w:p>
+    <w:p>
+      <w:pPr>
+        <w:pStyle w:val="Normal"/>
+        <w:spacing w:lineRule="auto" w:line="360" w:before="0" w:after="160"/>
+        <w:jc w:val="center"/>
+        <w:rPr/>
+      </w:pPr>
+      <w:r>
+        <w:rPr/>
+      </w:r>
+    </w:p>
+    <w:p>
+      <w:pPr>
+        <w:pStyle w:val="Normal"/>
+        <w:spacing w:lineRule="auto" w:line="360" w:before="0" w:after="160"/>
+        <w:jc w:val="center"/>
+        <w:rPr/>
+      </w:pPr>
+      <w:r>
+        <w:rPr>
+          <w:rFonts w:ascii="Times New Roman" w:hAnsi="Times New Roman" w:cs="Times New Roman" w:eastAsia="Times New Roman"/>
+          <w:b/>
+          <w:bCs/>
+          <w:sz w:val="24"/>
+          <w:szCs w:val="24"/>
+        </w:rPr>
+        <w:t>NOVEMBER, 2026</w:t>
+      </w:r>
+      <w:r>
+        <w:br w:type="page"/>
+      </w:r>
+    </w:p>
+    <w:p>
+      <w:pPr>
+        <w:pStyle w:val="Normal"/>
+        <w:spacing w:lineRule="auto" w:line="360" w:before="0" w:after="240"/>
+        <w:jc w:val="center"/>
+        <w:rPr/>
+      </w:pPr>
+      <w:r>
+        <w:rPr/>
+        <w:drawing>
+          <wp:inline distT="0" distB="0" distL="0" distR="0">
+            <wp:extent cx="5734050" cy="1143000"/>
+            <wp:effectExtent l="0" t="0" r="0" b="0"/>
+            <wp:docPr id="2" name="Image2" descr="SRIHER logo&#10;Sri Ramachandra Institute of Higher Education and Research"/>
+            <wp:cNvGraphicFramePr>
+              <a:graphicFrameLocks xmlns:a="http://schemas.openxmlformats.org/drawingml/2006/main" noChangeAspect="1"/>
+            </wp:cNvGraphicFramePr>
+            <a:graphic xmlns:a="http://schemas.openxmlformats.org/drawingml/2006/main">
+              <a:graphicData uri="http://schemas.openxmlformats.org/drawingml/2006/picture">
+                <pic:pic xmlns:pic="http://schemas.openxmlformats.org/drawingml/2006/picture">
+                  <pic:nvPicPr>
+                    <pic:cNvPr id="2" name="Image2" descr="SRIHER logo&#10;Sri Ramachandra Institute of Higher Education and Research"/>
+                    <pic:cNvPicPr>
+                      <a:picLocks noChangeAspect="1" noChangeArrowheads="1"/>
+                    </pic:cNvPicPr>
+                  </pic:nvPicPr>
+                  <pic:blipFill>
+                    <a:blip r:embed="rId3"/>
+                    <a:stretch>
+                      <a:fillRect/>
+                    </a:stretch>
+                  </pic:blipFill>
+                  <pic:spPr bwMode="auto">
+                    <a:xfrm>
+                      <a:off x="0" y="0"/>
+                      <a:ext cx="5734050" cy="1143000"/>
+                    </a:xfrm>
+                    <a:prstGeom prst="rect">
+                      <a:avLst/>
+                    </a:prstGeom>
+                    <a:noFill/>
+                  </pic:spPr>
+                </pic:pic>
+              </a:graphicData>
+            </a:graphic>
+          </wp:inline>
+        </w:drawing>
+      </w:r>
+    </w:p>
+    <w:p>
+      <w:pPr>
+        <w:pStyle w:val="Normal"/>
+        <w:spacing w:lineRule="auto" w:line="360" w:before="0" w:after="160"/>
+        <w:jc w:val="center"/>
+        <w:rPr/>
+      </w:pPr>
+      <w:r>
+        <w:rPr/>
+      </w:r>
+    </w:p>
+    <w:p>
+      <w:pPr>
+        <w:pStyle w:val="Normal"/>
+        <w:spacing w:lineRule="auto" w:line="360" w:before="0" w:after="240"/>
+        <w:jc w:val="center"/>
+        <w:rPr/>
+      </w:pPr>
+      <w:r>
+        <w:rPr>
+          <w:rFonts w:ascii="Times New Roman" w:hAnsi="Times New Roman" w:cs="Times New Roman" w:eastAsia="Times New Roman"/>
+          <w:b/>
+          <w:bCs/>
+          <w:sz w:val="32"/>
+          <w:szCs w:val="32"/>
+        </w:rPr>
+        <w:t>StructRender: Engine-Grounded Real-Time Neural Rendering of a Game in Learned Painterly Styles</w:t>
+      </w:r>
+    </w:p>
+    <w:p>
+      <w:pPr>
+        <w:pStyle w:val="Normal"/>
+        <w:spacing w:lineRule="auto" w:line="360" w:before="0" w:after="160"/>
+        <w:jc w:val="center"/>
+        <w:rPr/>
+      </w:pPr>
+      <w:r>
+        <w:rPr>
+          <w:rFonts w:ascii="Times New Roman" w:hAnsi="Times New Roman" w:cs="Times New Roman" w:eastAsia="Times New Roman"/>
+          <w:b/>
+          <w:bCs/>
+          <w:sz w:val="28"/>
+          <w:szCs w:val="28"/>
+        </w:rPr>
+        <w:t>ADA23DLU06 - RECENT TRENDS IN DEEP LEARNING LABORATORY</w:t>
+      </w:r>
+    </w:p>
+    <w:p>
+      <w:pPr>
+        <w:pStyle w:val="Normal"/>
+        <w:spacing w:lineRule="auto" w:line="360" w:before="0" w:after="160"/>
+        <w:jc w:val="center"/>
+        <w:rPr/>
+      </w:pPr>
+      <w:r>
+        <w:rPr>
+          <w:rFonts w:ascii="Times New Roman" w:hAnsi="Times New Roman" w:cs="Times New Roman" w:eastAsia="Times New Roman"/>
+          <w:b/>
+          <w:bCs/>
+          <w:sz w:val="24"/>
+          <w:szCs w:val="24"/>
+        </w:rPr>
+        <w:t>PROJECT REPORT</w:t>
+      </w:r>
+    </w:p>
+    <w:p>
+      <w:pPr>
+        <w:pStyle w:val="Normal"/>
+        <w:spacing w:lineRule="auto" w:line="360" w:before="0" w:after="160"/>
+        <w:jc w:val="center"/>
+        <w:rPr/>
+      </w:pPr>
+      <w:r>
+        <w:rPr/>
+      </w:r>
+    </w:p>
+    <w:p>
+      <w:pPr>
+        <w:pStyle w:val="Normal"/>
+        <w:spacing w:lineRule="auto" w:line="360" w:before="0" w:after="160"/>
+        <w:jc w:val="center"/>
+        <w:rPr/>
+      </w:pPr>
+      <w:r>
+        <w:rPr>
+          <w:rFonts w:ascii="Times New Roman" w:hAnsi="Times New Roman" w:cs="Times New Roman" w:eastAsia="Times New Roman"/>
+          <w:b/>
+          <w:bCs/>
+          <w:i/>
+          <w:iCs/>
+          <w:sz w:val="24"/>
+          <w:szCs w:val="24"/>
+        </w:rPr>
+        <w:t>Submitted by</w:t>
+      </w:r>
+    </w:p>
+    <w:p>
+      <w:pPr>
+        <w:pStyle w:val="Normal"/>
+        <w:spacing w:lineRule="auto" w:line="360" w:before="0" w:after="160"/>
+        <w:jc w:val="center"/>
+        <w:rPr/>
+      </w:pPr>
+      <w:r>
+        <w:rPr>
+          <w:rFonts w:ascii="Times New Roman" w:hAnsi="Times New Roman" w:cs="Times New Roman" w:eastAsia="Times New Roman"/>
+          <w:b/>
+          <w:bCs/>
+          <w:sz w:val="28"/>
+          <w:szCs w:val="28"/>
+        </w:rPr>
+        <w:t>KABILASH.S-E0323036</w:t>
+      </w:r>
+    </w:p>
+    <w:p>
+      <w:pPr>
+        <w:pStyle w:val="Normal"/>
+        <w:spacing w:lineRule="auto" w:line="360" w:before="0" w:after="160"/>
+        <w:jc w:val="center"/>
+        <w:rPr/>
+      </w:pPr>
+      <w:r>
+        <w:rPr>
+          <w:rFonts w:ascii="Times New Roman" w:hAnsi="Times New Roman" w:cs="Times New Roman" w:eastAsia="Times New Roman"/>
+          <w:b/>
+          <w:bCs/>
+          <w:sz w:val="28"/>
+          <w:szCs w:val="28"/>
+        </w:rPr>
+        <w:t>PAVITRA.P-E0323038</w:t>
+      </w:r>
+    </w:p>
+    <w:p>
+      <w:pPr>
+        <w:pStyle w:val="Normal"/>
+        <w:spacing w:lineRule="auto" w:line="360" w:before="0" w:after="160"/>
+        <w:jc w:val="center"/>
+        <w:rPr/>
+      </w:pPr>
+      <w:r>
+        <w:rPr/>
+      </w:r>
+    </w:p>
+    <w:p>
+      <w:pPr>
+        <w:pStyle w:val="Normal"/>
+        <w:spacing w:lineRule="auto" w:line="360" w:before="0" w:after="160"/>
+        <w:jc w:val="center"/>
+        <w:rPr/>
+      </w:pPr>
+      <w:r>
+        <w:rPr>
+          <w:rFonts w:ascii="Times New Roman" w:hAnsi="Times New Roman" w:cs="Times New Roman" w:eastAsia="Times New Roman"/>
+          <w:b/>
+          <w:bCs/>
+          <w:i/>
+          <w:iCs/>
+          <w:sz w:val="24"/>
+          <w:szCs w:val="24"/>
+        </w:rPr>
+        <w:t>In partial fulfilment for the award of the degree of</w:t>
+      </w:r>
+    </w:p>
+    <w:p>
+      <w:pPr>
+        <w:pStyle w:val="Normal"/>
+        <w:spacing w:lineRule="auto" w:line="360" w:before="0" w:after="160"/>
+        <w:jc w:val="center"/>
+        <w:rPr/>
+      </w:pPr>
+      <w:r>
+        <w:rPr>
+          <w:rFonts w:ascii="Times New Roman" w:hAnsi="Times New Roman" w:cs="Times New Roman" w:eastAsia="Times New Roman"/>
+          <w:b/>
+          <w:bCs/>
+          <w:sz w:val="24"/>
+          <w:szCs w:val="24"/>
+        </w:rPr>
+        <w:t>BACHELOR OF TECHNOLOGY</w:t>
+      </w:r>
+    </w:p>
+    <w:p>
+      <w:pPr>
+        <w:pStyle w:val="Normal"/>
+        <w:spacing w:lineRule="auto" w:line="360" w:before="0" w:after="160"/>
+        <w:jc w:val="center"/>
+        <w:rPr/>
+      </w:pPr>
+      <w:r>
+        <w:rPr>
+          <w:rFonts w:ascii="Times New Roman" w:hAnsi="Times New Roman" w:cs="Times New Roman" w:eastAsia="Times New Roman"/>
+          <w:b/>
+          <w:bCs/>
+          <w:sz w:val="24"/>
+          <w:szCs w:val="24"/>
+        </w:rPr>
+        <w:t>in</w:t>
+      </w:r>
+    </w:p>
+    <w:p>
+      <w:pPr>
+        <w:pStyle w:val="Normal"/>
+        <w:spacing w:lineRule="auto" w:line="360" w:before="0" w:after="160"/>
+        <w:jc w:val="center"/>
+        <w:rPr/>
+      </w:pPr>
+      <w:r>
+        <w:rPr>
+          <w:rFonts w:ascii="Times New Roman" w:hAnsi="Times New Roman" w:cs="Times New Roman" w:eastAsia="Times New Roman"/>
+          <w:b/>
+          <w:bCs/>
+          <w:sz w:val="24"/>
+          <w:szCs w:val="24"/>
+        </w:rPr>
+        <w:t>COMPUTER SCIENCE AND ENGINEERING</w:t>
+      </w:r>
+    </w:p>
+    <w:p>
+      <w:pPr>
+        <w:pStyle w:val="Normal"/>
+        <w:spacing w:lineRule="auto" w:line="360" w:before="0" w:after="160"/>
+        <w:jc w:val="center"/>
+        <w:rPr/>
+      </w:pPr>
+      <w:r>
+        <w:rPr>
+          <w:rFonts w:ascii="Times New Roman" w:hAnsi="Times New Roman" w:cs="Times New Roman" w:eastAsia="Times New Roman"/>
+          <w:b/>
+          <w:bCs/>
+          <w:sz w:val="24"/>
+          <w:szCs w:val="24"/>
+        </w:rPr>
+        <w:t>(Artificial Intelligence and Data Analytics)</w:t>
+      </w:r>
+    </w:p>
+    <w:p>
+      <w:pPr>
+        <w:pStyle w:val="Normal"/>
+        <w:spacing w:lineRule="auto" w:line="360" w:before="0" w:after="160"/>
+        <w:jc w:val="center"/>
+        <w:rPr/>
+      </w:pPr>
+      <w:r>
+        <w:rPr>
+          <w:rFonts w:ascii="Times New Roman" w:hAnsi="Times New Roman" w:cs="Times New Roman" w:eastAsia="Times New Roman"/>
+          <w:b/>
+          <w:bCs/>
+          <w:sz w:val="24"/>
+          <w:szCs w:val="24"/>
+        </w:rPr>
+        <w:t>Sri Ramachandra Faculty of Engineering and Technology</w:t>
+      </w:r>
+    </w:p>
+    <w:p>
+      <w:pPr>
+        <w:pStyle w:val="Normal"/>
+        <w:spacing w:lineRule="auto" w:line="360" w:before="0" w:after="160"/>
+        <w:jc w:val="center"/>
+        <w:rPr/>
+      </w:pPr>
+      <w:r>
+        <w:rPr>
+          <w:rFonts w:ascii="Times New Roman" w:hAnsi="Times New Roman" w:cs="Times New Roman" w:eastAsia="Times New Roman"/>
+          <w:b/>
+          <w:bCs/>
+          <w:sz w:val="24"/>
+          <w:szCs w:val="24"/>
+        </w:rPr>
+        <w:t>Sri Ramachandra Institute of Higher Education and Research, Porur, Chennai -600116</w:t>
+      </w:r>
+    </w:p>
+    <w:p>
+      <w:pPr>
+        <w:pStyle w:val="Normal"/>
+        <w:spacing w:lineRule="auto" w:line="360" w:before="0" w:after="160"/>
+        <w:jc w:val="center"/>
+        <w:rPr/>
+      </w:pPr>
+      <w:r>
+        <w:rPr/>
+      </w:r>
+    </w:p>
+    <w:p>
+      <w:pPr>
+        <w:pStyle w:val="Normal"/>
+        <w:spacing w:lineRule="auto" w:line="360" w:before="0" w:after="160"/>
+        <w:jc w:val="center"/>
+        <w:rPr/>
+      </w:pPr>
+      <w:r>
+        <w:rPr>
+          <w:rFonts w:ascii="Times New Roman" w:hAnsi="Times New Roman" w:cs="Times New Roman" w:eastAsia="Times New Roman"/>
+          <w:b/>
+          <w:bCs/>
+          <w:sz w:val="24"/>
+          <w:szCs w:val="24"/>
+        </w:rPr>
+        <w:t>NOVEMBER, 2026</w:t>
+      </w:r>
+      <w:r>
+        <w:br w:type="page"/>
+      </w:r>
+    </w:p>
+    <w:p>
+      <w:pPr>
+        <w:pStyle w:val="Normal"/>
+        <w:spacing w:lineRule="auto" w:line="360" w:before="0" w:after="240"/>
+        <w:jc w:val="center"/>
+        <w:rPr/>
+      </w:pPr>
+      <w:r>
+        <w:rPr/>
+        <w:drawing>
+          <wp:inline distT="0" distB="0" distL="0" distR="0">
+            <wp:extent cx="5734050" cy="1143000"/>
+            <wp:effectExtent l="0" t="0" r="0" b="0"/>
+            <wp:docPr id="3" name="Image3" descr="SRIHER logo&#10;Sri Ramachandra Institute of Higher Education and Research"/>
+            <wp:cNvGraphicFramePr>
+              <a:graphicFrameLocks xmlns:a="http://schemas.openxmlformats.org/drawingml/2006/main" noChangeAspect="1"/>
+            </wp:cNvGraphicFramePr>
+            <a:graphic xmlns:a="http://schemas.openxmlformats.org/drawingml/2006/main">
+              <a:graphicData uri="http://schemas.openxmlformats.org/drawingml/2006/picture">
+                <pic:pic xmlns:pic="http://schemas.openxmlformats.org/drawingml/2006/picture">
+                  <pic:nvPicPr>
+                    <pic:cNvPr id="3" name="Image3" descr="SRIHER logo&#10;Sri Ramachandra Institute of Higher Education and Research"/>
+                    <pic:cNvPicPr>
+                      <a:picLocks noChangeAspect="1" noChangeArrowheads="1"/>
+                    </pic:cNvPicPr>
+                  </pic:nvPicPr>
+                  <pic:blipFill>
+                    <a:blip r:embed="rId4"/>
+                    <a:stretch>
+                      <a:fillRect/>
+                    </a:stretch>
+                  </pic:blipFill>
+                  <pic:spPr bwMode="auto">
+                    <a:xfrm>
+                      <a:off x="0" y="0"/>
+                      <a:ext cx="5734050" cy="1143000"/>
+                    </a:xfrm>
+                    <a:prstGeom prst="rect">
+                      <a:avLst/>
+                    </a:prstGeom>
+                    <a:noFill/>
+                  </pic:spPr>
+                </pic:pic>
+              </a:graphicData>
+            </a:graphic>
+          </wp:inline>
+        </w:drawing>
+      </w:r>
+    </w:p>
+    <w:p>
+      <w:pPr>
+        <w:pStyle w:val="Normal"/>
+        <w:spacing w:lineRule="auto" w:line="360" w:before="0" w:after="160"/>
+        <w:jc w:val="center"/>
+        <w:rPr/>
+      </w:pPr>
+      <w:r>
+        <w:rPr/>
+      </w:r>
+    </w:p>
+    <w:p>
+      <w:pPr>
+        <w:pStyle w:val="Normal"/>
+        <w:spacing w:lineRule="auto" w:line="360" w:before="0" w:after="160"/>
+        <w:jc w:val="center"/>
+        <w:rPr/>
+      </w:pPr>
+      <w:r>
+        <w:rPr>
+          <w:rFonts w:ascii="Times New Roman" w:hAnsi="Times New Roman" w:cs="Times New Roman" w:eastAsia="Times New Roman"/>
+          <w:b/>
+          <w:bCs/>
+          <w:sz w:val="32"/>
+          <w:szCs w:val="32"/>
+        </w:rPr>
+        <w:t>BONAFIDE CERTIFICATE</w:t>
+      </w:r>
+    </w:p>
+    <w:p>
+      <w:pPr>
+        <w:pStyle w:val="Normal"/>
+        <w:spacing w:lineRule="auto" w:line="360" w:before="0" w:after="160"/>
+        <w:jc w:val="center"/>
+        <w:rPr/>
+      </w:pPr>
+      <w:r>
+        <w:rPr/>
+      </w:r>
+    </w:p>
+    <w:p>
+      <w:pPr>
+        <w:pStyle w:val="Normal"/>
+        <w:spacing w:lineRule="auto" w:line="360" w:before="0" w:after="160"/>
+        <w:jc w:val="both"/>
+        <w:rPr/>
+      </w:pPr>
+      <w:r>
+        <w:rPr>
+          <w:rFonts w:ascii="Times New Roman" w:hAnsi="Times New Roman" w:cs="Times New Roman" w:eastAsia="Times New Roman"/>
+          <w:sz w:val="24"/>
+          <w:szCs w:val="24"/>
+        </w:rPr>
+        <w:t xml:space="preserve">Certified that this project report </w:t>
+      </w:r>
+      <w:r>
+        <w:rPr>
+          <w:rFonts w:ascii="Times New Roman" w:hAnsi="Times New Roman" w:cs="Times New Roman" w:eastAsia="Times New Roman"/>
+          <w:b/>
+          <w:bCs/>
+          <w:sz w:val="24"/>
+          <w:szCs w:val="24"/>
+        </w:rPr>
+        <w:t>“StructRender: Engine-Grounded Real-Time Neural Rendering of a Game in Learned Painterly Styles”</w:t>
+      </w:r>
+      <w:r>
+        <w:rPr>
+          <w:rFonts w:ascii="Times New Roman" w:hAnsi="Times New Roman" w:cs="Times New Roman" w:eastAsia="Times New Roman"/>
+          <w:sz w:val="24"/>
+          <w:szCs w:val="24"/>
+        </w:rPr>
+        <w:t xml:space="preserve"> is the Bonafide record of work done by </w:t>
+      </w:r>
+      <w:r>
+        <w:rPr>
+          <w:rFonts w:ascii="Times New Roman" w:hAnsi="Times New Roman" w:cs="Times New Roman" w:eastAsia="Times New Roman"/>
+          <w:b/>
+          <w:bCs/>
+          <w:sz w:val="24"/>
+          <w:szCs w:val="24"/>
+        </w:rPr>
+        <w:t>“KABILASH.S-E0323036”</w:t>
+      </w:r>
+      <w:r>
+        <w:rPr>
+          <w:rFonts w:ascii="Times New Roman" w:hAnsi="Times New Roman" w:cs="Times New Roman" w:eastAsia="Times New Roman"/>
+          <w:sz w:val="24"/>
+          <w:szCs w:val="24"/>
+        </w:rPr>
+        <w:t xml:space="preserve"> and </w:t>
+      </w:r>
+      <w:r>
+        <w:rPr>
+          <w:rFonts w:ascii="Times New Roman" w:hAnsi="Times New Roman" w:cs="Times New Roman" w:eastAsia="Times New Roman"/>
+          <w:b/>
+          <w:bCs/>
+          <w:sz w:val="24"/>
+          <w:szCs w:val="24"/>
+        </w:rPr>
+        <w:t>“PAVITRA.P-E0323038”</w:t>
+      </w:r>
+      <w:r>
+        <w:rPr>
+          <w:rFonts w:ascii="Times New Roman" w:hAnsi="Times New Roman" w:cs="Times New Roman" w:eastAsia="Times New Roman"/>
+          <w:sz w:val="24"/>
+          <w:szCs w:val="24"/>
+        </w:rPr>
+        <w:t xml:space="preserve"> who carried out the work under my supervision.</w:t>
+      </w:r>
+    </w:p>
+    <w:p>
+      <w:pPr>
+        <w:pStyle w:val="Normal"/>
+        <w:spacing w:lineRule="auto" w:line="360" w:before="0" w:after="240"/>
+        <w:jc w:val="center"/>
+        <w:rPr/>
+      </w:pPr>
+      <w:r>
+        <w:rPr/>
+      </w:r>
+    </w:p>
+    <w:p>
+      <w:pPr>
+        <w:pStyle w:val="Normal"/>
+        <w:spacing w:lineRule="auto" w:line="360" w:before="0" w:after="240"/>
+        <w:jc w:val="center"/>
+        <w:rPr/>
+      </w:pPr>
+      <w:r>
+        <w:rPr/>
+      </w:r>
+    </w:p>
+    <w:p>
+      <w:pPr>
+        <w:pStyle w:val="Normal"/>
+        <w:tabs>
+          <w:tab w:val="clear" w:pos="720"/>
+          <w:tab w:val="left" w:pos="5400" w:leader="none"/>
+        </w:tabs>
+        <w:spacing w:lineRule="auto" w:line="360" w:before="0" w:after="240"/>
+        <w:rPr/>
+      </w:pPr>
+      <w:r>
+        <w:rPr>
+          <w:rFonts w:ascii="Times New Roman" w:hAnsi="Times New Roman" w:cs="Times New Roman" w:eastAsia="Times New Roman"/>
+          <w:b/>
+          <w:bCs/>
+          <w:sz w:val="24"/>
+          <w:szCs w:val="24"/>
+        </w:rPr>
+        <w:t>Signature of the Supervisor</w:t>
+        <w:tab/>
+        <w:t>Signature of External Examiner</w:t>
+      </w:r>
+    </w:p>
+    <w:p>
+      <w:pPr>
+        <w:pStyle w:val="Normal"/>
+        <w:spacing w:lineRule="auto" w:line="360" w:before="0" w:after="240"/>
+        <w:jc w:val="center"/>
+        <w:rPr/>
+      </w:pPr>
+      <w:r>
+        <w:rPr/>
+      </w:r>
+    </w:p>
+    <w:p>
+      <w:pPr>
+        <w:pStyle w:val="Normal"/>
+        <w:spacing w:lineRule="auto" w:line="360" w:before="0" w:after="0"/>
+        <w:ind w:right="4562"/>
+        <w:jc w:val="both"/>
+        <w:rPr/>
+      </w:pPr>
+      <w:r>
+        <w:rPr>
+          <w:rFonts w:ascii="Times New Roman" w:hAnsi="Times New Roman" w:cs="Times New Roman" w:eastAsia="Times New Roman"/>
+          <w:sz w:val="24"/>
+          <w:szCs w:val="24"/>
+        </w:rPr>
+        <w:t>Dr. V. Vanitha</w:t>
+      </w:r>
+    </w:p>
+    <w:p>
+      <w:pPr>
+        <w:pStyle w:val="Normal"/>
+        <w:spacing w:lineRule="auto" w:line="360" w:before="0" w:after="0"/>
+        <w:ind w:right="4562"/>
+        <w:jc w:val="both"/>
+        <w:rPr/>
+      </w:pPr>
+      <w:r>
+        <w:rPr>
+          <w:rFonts w:ascii="Times New Roman" w:hAnsi="Times New Roman" w:cs="Times New Roman" w:eastAsia="Times New Roman"/>
+          <w:sz w:val="24"/>
+          <w:szCs w:val="24"/>
+        </w:rPr>
+        <w:t>Associate Professor,</w:t>
+      </w:r>
+    </w:p>
+    <w:p>
+      <w:pPr>
+        <w:pStyle w:val="Normal"/>
+        <w:spacing w:lineRule="auto" w:line="360" w:before="0" w:after="0"/>
+        <w:ind w:right="4562"/>
+        <w:jc w:val="both"/>
+        <w:rPr/>
+      </w:pPr>
+      <w:r>
+        <w:rPr>
+          <w:rFonts w:ascii="Times New Roman" w:hAnsi="Times New Roman" w:cs="Times New Roman" w:eastAsia="Times New Roman"/>
+          <w:sz w:val="24"/>
+          <w:szCs w:val="24"/>
+        </w:rPr>
+        <w:t>Department of Computer Science and Engineering (AIML), Sri Ramachandra Faculty of Engineering and Technology,</w:t>
+      </w:r>
+    </w:p>
+    <w:p>
+      <w:pPr>
+        <w:pStyle w:val="Normal"/>
+        <w:spacing w:lineRule="auto" w:line="360" w:before="0" w:after="0"/>
+        <w:ind w:right="4562"/>
+        <w:jc w:val="both"/>
+        <w:rPr/>
+      </w:pPr>
+      <w:r>
+        <w:rPr>
+          <w:rFonts w:ascii="Times New Roman" w:hAnsi="Times New Roman" w:cs="Times New Roman" w:eastAsia="Times New Roman"/>
+          <w:sz w:val="24"/>
+          <w:szCs w:val="24"/>
+        </w:rPr>
+        <w:t>SRIHER, Porur, Chennai-600 116.</w:t>
+      </w:r>
+    </w:p>
+    <w:p>
+      <w:pPr>
+        <w:pStyle w:val="Normal"/>
+        <w:spacing w:lineRule="auto" w:line="360" w:before="0" w:after="0"/>
+        <w:jc w:val="center"/>
+        <w:rPr/>
+      </w:pPr>
+      <w:r>
+        <w:rPr/>
+      </w:r>
+    </w:p>
+    <w:p>
+      <w:pPr>
+        <w:pStyle w:val="Normal"/>
+        <w:spacing w:lineRule="auto" w:line="360" w:before="0" w:after="120"/>
         <w:rPr/>
         <w:sectPr>
           <w:type w:val="nextPage"/>
@@ -210,13 +1017,21 @@
       </w:pPr>
       <w:r>
         <w:rPr>
-          <w:rFonts w:eastAsia="Times New Roman" w:cs="Times New Roman"/>
+          <w:rFonts w:ascii="Times New Roman" w:hAnsi="Times New Roman" w:cs="Times New Roman" w:eastAsia="Times New Roman"/>
           <w:b/>
           <w:bCs/>
-          <w:sz w:val="26"/>
-          <w:szCs w:val="26"/>
-        </w:rPr>
-        <w:t>October 2026</w:t>
+          <w:sz w:val="24"/>
+          <w:szCs w:val="24"/>
+        </w:rPr>
+        <w:t xml:space="preserve">Evaluation Date: </w:t>
+      </w:r>
+      <w:r>
+        <w:rPr>
+          <w:rFonts w:ascii="Times New Roman" w:hAnsi="Times New Roman" w:cs="Times New Roman" w:eastAsia="Times New Roman"/>
+          <w:sz w:val="24"/>
+          <w:szCs w:val="24"/>
+        </w:rPr>
+        <w:t>2 November 2026</w:t>
       </w:r>
     </w:p>
     <w:p>
@@ -224,7 +1039,7 @@
         <w:pStyle w:val="FrontHeading"/>
         <w:rPr/>
       </w:pPr>
-      <w:bookmarkStart w:id="0" w:name="__RefHeading___Toc2074_1190944670"/>
+      <w:bookmarkStart w:id="0" w:name="__RefHeading___Toc2109_726659325"/>
       <w:bookmarkEnd w:id="0"/>
       <w:r>
         <w:rPr/>
@@ -342,7 +1157,7 @@
             </w:rPr>
             <w:fldChar w:fldCharType="separate"/>
           </w:r>
-          <w:hyperlink w:anchor="__RefHeading___Toc2074_1190944670" w:tooltip="ABSTRACT">
+          <w:hyperlink w:anchor="__RefHeading___Toc2109_726659325" w:tooltip="ABSTRACT">
             <w:r>
               <w:rPr>
                 <w:rStyle w:val="IndexLink"/>
@@ -362,7 +1177,7 @@
             </w:tabs>
             <w:rPr/>
           </w:pPr>
-          <w:hyperlink w:anchor="__RefHeading___Toc2076_1190944670" w:tooltip="LIST OF TABLES">
+          <w:hyperlink w:anchor="__RefHeading___Toc2111_726659325" w:tooltip="LIST OF TABLES">
             <w:r>
               <w:rPr>
                 <w:rStyle w:val="IndexLink"/>
@@ -382,7 +1197,7 @@
             </w:tabs>
             <w:rPr/>
           </w:pPr>
-          <w:hyperlink w:anchor="__RefHeading___Toc2078_1190944670" w:tooltip="LIST OF FIGURES">
+          <w:hyperlink w:anchor="__RefHeading___Toc2113_726659325" w:tooltip="LIST OF FIGURES">
             <w:r>
               <w:rPr>
                 <w:rStyle w:val="IndexLink"/>
@@ -402,7 +1217,7 @@
             </w:tabs>
             <w:rPr/>
           </w:pPr>
-          <w:hyperlink w:anchor="__RefHeading___Toc2080_1190944670" w:tooltip="LIST OF ABBREVIATIONS">
+          <w:hyperlink w:anchor="__RefHeading___Toc2115_726659325" w:tooltip="LIST OF ABBREVIATIONS">
             <w:r>
               <w:rPr>
                 <w:rStyle w:val="IndexLink"/>
@@ -422,7 +1237,7 @@
             </w:tabs>
             <w:rPr/>
           </w:pPr>
-          <w:hyperlink w:anchor="__RefHeading___Toc2082_1190944670" w:tooltip="CHAPTER 1: INTRODUCTION">
+          <w:hyperlink w:anchor="__RefHeading___Toc2117_726659325" w:tooltip="CHAPTER 1: INTRODUCTION">
             <w:r>
               <w:rPr>
                 <w:rStyle w:val="IndexLink"/>
@@ -442,7 +1257,7 @@
             </w:tabs>
             <w:rPr/>
           </w:pPr>
-          <w:hyperlink w:anchor="__RefHeading___Toc2084_1190944670" w:tooltip="1.1 Project Overview">
+          <w:hyperlink w:anchor="__RefHeading___Toc2119_726659325" w:tooltip="1.1 Project Overview">
             <w:r>
               <w:rPr>
                 <w:rStyle w:val="IndexLink"/>
@@ -462,7 +1277,7 @@
             </w:tabs>
             <w:rPr/>
           </w:pPr>
-          <w:hyperlink w:anchor="__RefHeading___Toc2086_1190944670" w:tooltip="1.2 Problem Statement">
+          <w:hyperlink w:anchor="__RefHeading___Toc2121_726659325" w:tooltip="1.2 Problem Statement">
             <w:r>
               <w:rPr>
                 <w:rStyle w:val="IndexLink"/>
@@ -482,7 +1297,7 @@
             </w:tabs>
             <w:rPr/>
           </w:pPr>
-          <w:hyperlink w:anchor="__RefHeading___Toc2088_1190944670" w:tooltip="1.3 Objectives">
+          <w:hyperlink w:anchor="__RefHeading___Toc2123_726659325" w:tooltip="1.3 Objectives">
             <w:r>
               <w:rPr>
                 <w:rStyle w:val="IndexLink"/>
@@ -502,7 +1317,7 @@
             </w:tabs>
             <w:rPr/>
           </w:pPr>
-          <w:hyperlink w:anchor="__RefHeading___Toc2090_1190944670" w:tooltip="1.4 Scope of Work and Social Contribution">
+          <w:hyperlink w:anchor="__RefHeading___Toc2125_726659325" w:tooltip="1.4 Scope of Work and Social Contribution">
             <w:r>
               <w:rPr>
                 <w:rStyle w:val="IndexLink"/>
@@ -522,7 +1337,7 @@
             </w:tabs>
             <w:rPr/>
           </w:pPr>
-          <w:hyperlink w:anchor="__RefHeading___Toc2092_1190944670" w:tooltip="CHAPTER 2: LITERATURE REVIEW">
+          <w:hyperlink w:anchor="__RefHeading___Toc2127_726659325" w:tooltip="CHAPTER 2: LITERATURE REVIEW">
             <w:r>
               <w:rPr>
                 <w:rStyle w:val="IndexLink"/>
@@ -542,7 +1357,7 @@
             </w:tabs>
             <w:rPr/>
           </w:pPr>
-          <w:hyperlink w:anchor="__RefHeading___Toc2094_1190944670" w:tooltip="2.1 Background">
+          <w:hyperlink w:anchor="__RefHeading___Toc2129_726659325" w:tooltip="2.1 Background">
             <w:r>
               <w:rPr>
                 <w:rStyle w:val="IndexLink"/>
@@ -562,7 +1377,7 @@
             </w:tabs>
             <w:rPr/>
           </w:pPr>
-          <w:hyperlink w:anchor="__RefHeading___Toc2096_1190944670" w:tooltip="2.1.1 Review of Related Work">
+          <w:hyperlink w:anchor="__RefHeading___Toc2131_726659325" w:tooltip="2.1.1 Review of Related Work">
             <w:r>
               <w:rPr>
                 <w:rStyle w:val="IndexLink"/>
@@ -582,7 +1397,7 @@
             </w:tabs>
             <w:rPr/>
           </w:pPr>
-          <w:hyperlink w:anchor="__RefHeading___Toc2098_1190944670" w:tooltip="2.2 Research Gaps">
+          <w:hyperlink w:anchor="__RefHeading___Toc2133_726659325" w:tooltip="2.2 Research Gaps">
             <w:r>
               <w:rPr>
                 <w:rStyle w:val="IndexLink"/>
@@ -602,7 +1417,7 @@
             </w:tabs>
             <w:rPr/>
           </w:pPr>
-          <w:hyperlink w:anchor="__RefHeading___Toc2100_1190944670" w:tooltip="CHAPTER 3: PROPOSED METHODOLOGY">
+          <w:hyperlink w:anchor="__RefHeading___Toc2135_726659325" w:tooltip="CHAPTER 3: PROPOSED METHODOLOGY">
             <w:r>
               <w:rPr>
                 <w:rStyle w:val="IndexLink"/>
@@ -622,7 +1437,7 @@
             </w:tabs>
             <w:rPr/>
           </w:pPr>
-          <w:hyperlink w:anchor="__RefHeading___Toc2102_1190944670" w:tooltip="3.1 Architecture in a Nutshell">
+          <w:hyperlink w:anchor="__RefHeading___Toc2137_726659325" w:tooltip="3.1 Architecture in a Nutshell">
             <w:r>
               <w:rPr>
                 <w:rStyle w:val="IndexLink"/>
@@ -642,7 +1457,7 @@
             </w:tabs>
             <w:rPr/>
           </w:pPr>
-          <w:hyperlink w:anchor="__RefHeading___Toc2104_1190944670" w:tooltip="3.1.1 Dataset Description">
+          <w:hyperlink w:anchor="__RefHeading___Toc2139_726659325" w:tooltip="3.1.1 Dataset Description">
             <w:r>
               <w:rPr>
                 <w:rStyle w:val="IndexLink"/>
@@ -662,7 +1477,7 @@
             </w:tabs>
             <w:rPr/>
           </w:pPr>
-          <w:hyperlink w:anchor="__RefHeading___Toc2106_1190944670" w:tooltip="3.1.2 Preprocessing">
+          <w:hyperlink w:anchor="__RefHeading___Toc2141_726659325" w:tooltip="3.1.2 Preprocessing">
             <w:r>
               <w:rPr>
                 <w:rStyle w:val="IndexLink"/>
@@ -682,7 +1497,7 @@
             </w:tabs>
             <w:rPr/>
           </w:pPr>
-          <w:hyperlink w:anchor="__RefHeading___Toc2108_1190944670" w:tooltip="3.1.3 Encoder Layer (Feature-Extraction and Rendering Network)">
+          <w:hyperlink w:anchor="__RefHeading___Toc2143_726659325" w:tooltip="3.1.3 Encoder Layer (Feature-Extraction and Rendering Network)">
             <w:r>
               <w:rPr>
                 <w:rStyle w:val="IndexLink"/>
@@ -702,7 +1517,7 @@
             </w:tabs>
             <w:rPr/>
           </w:pPr>
-          <w:hyperlink w:anchor="__RefHeading___Toc2110_1190944670" w:tooltip="3.2 Hardware Specifications">
+          <w:hyperlink w:anchor="__RefHeading___Toc2145_726659325" w:tooltip="3.2 Hardware Specifications">
             <w:r>
               <w:rPr>
                 <w:rStyle w:val="IndexLink"/>
@@ -722,7 +1537,7 @@
             </w:tabs>
             <w:rPr/>
           </w:pPr>
-          <w:hyperlink w:anchor="__RefHeading___Toc2112_1190944670" w:tooltip="3.3 Software Specifications">
+          <w:hyperlink w:anchor="__RefHeading___Toc2147_726659325" w:tooltip="3.3 Software Specifications">
             <w:r>
               <w:rPr>
                 <w:rStyle w:val="IndexLink"/>
@@ -742,7 +1557,7 @@
             </w:tabs>
             <w:rPr/>
           </w:pPr>
-          <w:hyperlink w:anchor="__RefHeading___Toc2114_1190944670" w:tooltip="CHAPTER 4: PERFORMANCE EVALUATION">
+          <w:hyperlink w:anchor="__RefHeading___Toc2149_726659325" w:tooltip="CHAPTER 4: PERFORMANCE EVALUATION">
             <w:r>
               <w:rPr>
                 <w:rStyle w:val="IndexLink"/>
@@ -762,7 +1577,7 @@
             </w:tabs>
             <w:rPr/>
           </w:pPr>
-          <w:hyperlink w:anchor="__RefHeading___Toc2116_1190944670" w:tooltip="4.1 Experimental Setup">
+          <w:hyperlink w:anchor="__RefHeading___Toc2151_726659325" w:tooltip="4.1 Experimental Setup">
             <w:r>
               <w:rPr>
                 <w:rStyle w:val="IndexLink"/>
@@ -782,7 +1597,7 @@
             </w:tabs>
             <w:rPr/>
           </w:pPr>
-          <w:hyperlink w:anchor="__RefHeading___Toc2118_1190944670" w:tooltip="4.2 Evaluation Metrics">
+          <w:hyperlink w:anchor="__RefHeading___Toc2153_726659325" w:tooltip="4.2 Evaluation Metrics">
             <w:r>
               <w:rPr>
                 <w:rStyle w:val="IndexLink"/>
@@ -802,7 +1617,7 @@
             </w:tabs>
             <w:rPr/>
           </w:pPr>
-          <w:hyperlink w:anchor="__RefHeading___Toc2120_1190944670" w:tooltip="4.3 Results and Analysis">
+          <w:hyperlink w:anchor="__RefHeading___Toc2155_726659325" w:tooltip="4.3 Results and Analysis">
             <w:r>
               <w:rPr>
                 <w:rStyle w:val="IndexLink"/>
@@ -822,7 +1637,7 @@
             </w:tabs>
             <w:rPr/>
           </w:pPr>
-          <w:hyperlink w:anchor="__RefHeading___Toc2122_1190944670" w:tooltip="4.3.1 Training Behaviour">
+          <w:hyperlink w:anchor="__RefHeading___Toc2157_726659325" w:tooltip="4.3.1 Training Behaviour">
             <w:r>
               <w:rPr>
                 <w:rStyle w:val="IndexLink"/>
@@ -842,7 +1657,7 @@
             </w:tabs>
             <w:rPr/>
           </w:pPr>
-          <w:hyperlink w:anchor="__RefHeading___Toc2124_1190944670" w:tooltip="4.3.2 Ablation Ladder">
+          <w:hyperlink w:anchor="__RefHeading___Toc2159_726659325" w:tooltip="4.3.2 Ablation Ladder">
             <w:r>
               <w:rPr>
                 <w:rStyle w:val="IndexLink"/>
@@ -862,7 +1677,7 @@
             </w:tabs>
             <w:rPr/>
           </w:pPr>
-          <w:hyperlink w:anchor="__RefHeading___Toc2126_1190944670" w:tooltip="4.3.3 The Deployed Two-Style Model">
+          <w:hyperlink w:anchor="__RefHeading___Toc2161_726659325" w:tooltip="4.3.3 The Deployed Two-Style Model">
             <w:r>
               <w:rPr>
                 <w:rStyle w:val="IndexLink"/>
@@ -882,7 +1697,7 @@
             </w:tabs>
             <w:rPr/>
           </w:pPr>
-          <w:hyperlink w:anchor="__RefHeading___Toc2128_1190944670" w:tooltip="4.3.4 Live Deployment">
+          <w:hyperlink w:anchor="__RefHeading___Toc2163_726659325" w:tooltip="4.3.4 Live Deployment">
             <w:r>
               <w:rPr>
                 <w:rStyle w:val="IndexLink"/>
@@ -902,7 +1717,7 @@
             </w:tabs>
             <w:rPr/>
           </w:pPr>
-          <w:hyperlink w:anchor="__RefHeading___Toc2130_1190944670" w:tooltip="4.3.5 Assessment of Objectives and Limitations">
+          <w:hyperlink w:anchor="__RefHeading___Toc2165_726659325" w:tooltip="4.3.5 Assessment of Objectives and Limitations">
             <w:r>
               <w:rPr>
                 <w:rStyle w:val="IndexLink"/>
@@ -922,7 +1737,7 @@
             </w:tabs>
             <w:rPr/>
           </w:pPr>
-          <w:hyperlink w:anchor="__RefHeading___Toc2132_1190944670" w:tooltip="CHAPTER 5: CONCLUSION AND FUTURE WORK">
+          <w:hyperlink w:anchor="__RefHeading___Toc2167_726659325" w:tooltip="CHAPTER 5: CONCLUSION AND FUTURE WORK">
             <w:r>
               <w:rPr>
                 <w:rStyle w:val="IndexLink"/>
@@ -942,7 +1757,7 @@
             </w:tabs>
             <w:rPr/>
           </w:pPr>
-          <w:hyperlink w:anchor="__RefHeading___Toc2134_1190944670" w:tooltip="5.1 Summary of the Contributions">
+          <w:hyperlink w:anchor="__RefHeading___Toc2169_726659325" w:tooltip="5.1 Summary of the Contributions">
             <w:r>
               <w:rPr>
                 <w:rStyle w:val="IndexLink"/>
@@ -962,7 +1777,7 @@
             </w:tabs>
             <w:rPr/>
           </w:pPr>
-          <w:hyperlink w:anchor="__RefHeading___Toc2136_1190944670" w:tooltip="5.2 Future Work">
+          <w:hyperlink w:anchor="__RefHeading___Toc2171_726659325" w:tooltip="5.2 Future Work">
             <w:r>
               <w:rPr>
                 <w:rStyle w:val="IndexLink"/>
@@ -982,7 +1797,7 @@
             </w:tabs>
             <w:rPr/>
           </w:pPr>
-          <w:hyperlink w:anchor="__RefHeading___Toc2138_1190944670" w:tooltip="REFERENCES">
+          <w:hyperlink w:anchor="__RefHeading___Toc2173_726659325" w:tooltip="REFERENCES">
             <w:r>
               <w:rPr>
                 <w:rStyle w:val="IndexLink"/>
@@ -1002,7 +1817,7 @@
             </w:tabs>
             <w:rPr/>
           </w:pPr>
-          <w:hyperlink w:anchor="__RefHeading___Toc2140_1190944670" w:tooltip="APPENDICES">
+          <w:hyperlink w:anchor="__RefHeading___Toc2175_726659325" w:tooltip="APPENDICES">
             <w:r>
               <w:rPr>
                 <w:rStyle w:val="IndexLink"/>
@@ -1022,7 +1837,7 @@
             </w:tabs>
             <w:rPr/>
           </w:pPr>
-          <w:hyperlink w:anchor="__RefHeading___Toc2142_1190944670" w:tooltip="Appendix A: Deployed Model Configuration (abridged)">
+          <w:hyperlink w:anchor="__RefHeading___Toc2177_726659325" w:tooltip="Appendix A: Deployed Model Configuration (abridged)">
             <w:r>
               <w:rPr>
                 <w:rStyle w:val="IndexLink"/>
@@ -1042,7 +1857,7 @@
             </w:tabs>
             <w:rPr/>
           </w:pPr>
-          <w:hyperlink w:anchor="__RefHeading___Toc2144_1190944670" w:tooltip="Appendix B: Milestone Scorecard">
+          <w:hyperlink w:anchor="__RefHeading___Toc2179_726659325" w:tooltip="Appendix B: Milestone Scorecard">
             <w:r>
               <w:rPr>
                 <w:rStyle w:val="IndexLink"/>
@@ -1062,7 +1877,7 @@
             </w:tabs>
             <w:rPr/>
           </w:pPr>
-          <w:hyperlink w:anchor="__RefHeading___Toc2146_1190944670" w:tooltip="Appendix C: Supplementary Screenshots">
+          <w:hyperlink w:anchor="__RefHeading___Toc2181_726659325" w:tooltip="Appendix C: Supplementary Screenshots">
             <w:r>
               <w:rPr>
                 <w:rStyle w:val="IndexLink"/>
@@ -1095,7 +1910,7 @@
         <w:pStyle w:val="FrontHeading"/>
         <w:rPr/>
       </w:pPr>
-      <w:bookmarkStart w:id="1" w:name="__RefHeading___Toc2076_1190944670"/>
+      <w:bookmarkStart w:id="1" w:name="__RefHeading___Toc2111_726659325"/>
       <w:bookmarkEnd w:id="1"/>
       <w:r>
         <w:rPr/>
@@ -1134,7 +1949,7 @@
             </w:rPr>
             <w:fldChar w:fldCharType="separate"/>
           </w:r>
-          <w:hyperlink w:anchor="__RefHeading___Toc2148_1190944670" w:tooltip="Table 2.1: Comparison of related work">
+          <w:hyperlink w:anchor="__RefHeading___Toc2183_726659325" w:tooltip="Table 2.1: Comparison of related work">
             <w:r>
               <w:rPr>
                 <w:rStyle w:val="IndexLink"/>
@@ -1154,7 +1969,7 @@
             </w:tabs>
             <w:rPr/>
           </w:pPr>
-          <w:hyperlink w:anchor="__RefHeading___Toc2176_1190944670" w:tooltip="Table 2.2: Research gaps and how StructRender addresses them">
+          <w:hyperlink w:anchor="__RefHeading___Toc2211_726659325" w:tooltip="Table 2.2: Research gaps and how StructRender addresses them">
             <w:r>
               <w:rPr>
                 <w:rStyle w:val="IndexLink"/>
@@ -1174,7 +1989,7 @@
             </w:tabs>
             <w:rPr/>
           </w:pPr>
-          <w:hyperlink w:anchor="__RefHeading___Toc2174_1190944670" w:tooltip="Table 3.1: Dataset summary">
+          <w:hyperlink w:anchor="__RefHeading___Toc2209_726659325" w:tooltip="Table 3.1: Dataset summary">
             <w:r>
               <w:rPr>
                 <w:rStyle w:val="IndexLink"/>
@@ -1194,7 +2009,7 @@
             </w:tabs>
             <w:rPr/>
           </w:pPr>
-          <w:hyperlink w:anchor="__RefHeading___Toc2172_1190944670" w:tooltip="Table 3.2: Offline teacher configuration">
+          <w:hyperlink w:anchor="__RefHeading___Toc2207_726659325" w:tooltip="Table 3.2: Offline teacher configuration">
             <w:r>
               <w:rPr>
                 <w:rStyle w:val="IndexLink"/>
@@ -1214,7 +2029,7 @@
             </w:tabs>
             <w:rPr/>
           </w:pPr>
-          <w:hyperlink w:anchor="__RefHeading___Toc2170_1190944670" w:tooltip="Table 3.3: Alignment gates (thresholds fixed before the data)">
+          <w:hyperlink w:anchor="__RefHeading___Toc2205_726659325" w:tooltip="Table 3.3: Alignment gates (thresholds fixed before the data)">
             <w:r>
               <w:rPr>
                 <w:rStyle w:val="IndexLink"/>
@@ -1234,7 +2049,7 @@
             </w:tabs>
             <w:rPr/>
           </w:pPr>
-          <w:hyperlink w:anchor="__RefHeading___Toc2168_1190944670" w:tooltip="Table 3.4: Parameters of StyleTemporalUNet by block (counted from the model)">
+          <w:hyperlink w:anchor="__RefHeading___Toc2203_726659325" w:tooltip="Table 3.4: Parameters of StyleTemporalUNet by block (counted from the model)">
             <w:r>
               <w:rPr>
                 <w:rStyle w:val="IndexLink"/>
@@ -1254,7 +2069,7 @@
             </w:tabs>
             <w:rPr/>
           </w:pPr>
-          <w:hyperlink w:anchor="__RefHeading___Toc2166_1190944670" w:tooltip="Table 3.5: Hardware used for all experiments">
+          <w:hyperlink w:anchor="__RefHeading___Toc2201_726659325" w:tooltip="Table 3.5: Hardware used for all experiments">
             <w:r>
               <w:rPr>
                 <w:rStyle w:val="IndexLink"/>
@@ -1274,7 +2089,7 @@
             </w:tabs>
             <w:rPr/>
           </w:pPr>
-          <w:hyperlink w:anchor="__RefHeading___Toc2164_1190944670" w:tooltip="Table 3.6: Software environment (versions read from the environment)">
+          <w:hyperlink w:anchor="__RefHeading___Toc2199_726659325" w:tooltip="Table 3.6: Software environment (versions read from the environment)">
             <w:r>
               <w:rPr>
                 <w:rStyle w:val="IndexLink"/>
@@ -1294,7 +2109,7 @@
             </w:tabs>
             <w:rPr/>
           </w:pPr>
-          <w:hyperlink w:anchor="__RefHeading___Toc2162_1190944670" w:tooltip="Table 4.1: Training and evaluation configuration of the deployed model">
+          <w:hyperlink w:anchor="__RefHeading___Toc2197_726659325" w:tooltip="Table 4.1: Training and evaluation configuration of the deployed model">
             <w:r>
               <w:rPr>
                 <w:rStyle w:val="IndexLink"/>
@@ -1314,7 +2129,7 @@
             </w:tabs>
             <w:rPr/>
           </w:pPr>
-          <w:hyperlink w:anchor="__RefHeading___Toc2160_1190944670" w:tooltip="Table 4.2: Ablation ladder on the sealed seed-scene test split">
+          <w:hyperlink w:anchor="__RefHeading___Toc2195_726659325" w:tooltip="Table 4.2: Ablation ladder on the sealed seed-scene test split">
             <w:r>
               <w:rPr>
                 <w:rStyle w:val="IndexLink"/>
@@ -1334,7 +2149,7 @@
             </w:tabs>
             <w:rPr/>
           </w:pPr>
-          <w:hyperlink w:anchor="__RefHeading___Toc2158_1190944670" w:tooltip="Table 4.3: Game test sessions (2,968 frames per style)">
+          <w:hyperlink w:anchor="__RefHeading___Toc2193_726659325" w:tooltip="Table 4.3: Game test sessions (2,968 frames per style)">
             <w:r>
               <w:rPr>
                 <w:rStyle w:val="IndexLink"/>
@@ -1354,7 +2169,7 @@
             </w:tabs>
             <w:rPr/>
           </w:pPr>
-          <w:hyperlink w:anchor="__RefHeading___Toc2156_1190944670" w:tooltip="Table 4.4: Equivalence chain from evaluator to live game">
+          <w:hyperlink w:anchor="__RefHeading___Toc2191_726659325" w:tooltip="Table 4.4: Equivalence chain from evaluator to live game">
             <w:r>
               <w:rPr>
                 <w:rStyle w:val="IndexLink"/>
@@ -1374,7 +2189,7 @@
             </w:tabs>
             <w:rPr/>
           </w:pPr>
-          <w:hyperlink w:anchor="__RefHeading___Toc2154_1190944670" w:tooltip="Table 4.5: M10 exit criteria, measured on the playable game">
+          <w:hyperlink w:anchor="__RefHeading___Toc2189_726659325" w:tooltip="Table 4.5: M10 exit criteria, measured on the playable game">
             <w:r>
               <w:rPr>
                 <w:rStyle w:val="IndexLink"/>
@@ -1394,7 +2209,7 @@
             </w:tabs>
             <w:rPr/>
           </w:pPr>
-          <w:hyperlink w:anchor="__RefHeading___Toc2152_1190944670" w:tooltip="Table 4.6: Objectives and the evidence for each">
+          <w:hyperlink w:anchor="__RefHeading___Toc2187_726659325" w:tooltip="Table 4.6: Objectives and the evidence for each">
             <w:r>
               <w:rPr>
                 <w:rStyle w:val="IndexLink"/>
@@ -1414,7 +2229,7 @@
             </w:tabs>
             <w:rPr/>
           </w:pPr>
-          <w:hyperlink w:anchor="__RefHeading___Toc2150_1190944670" w:tooltip="Table B.1: Milestones M0–M10 and their verdicts">
+          <w:hyperlink w:anchor="__RefHeading___Toc2185_726659325" w:tooltip="Table B.1: Milestones M0–M10 and their verdicts">
             <w:r>
               <w:rPr>
                 <w:rStyle w:val="IndexLink"/>
@@ -1447,7 +2262,7 @@
         <w:pStyle w:val="FrontHeading"/>
         <w:rPr/>
       </w:pPr>
-      <w:bookmarkStart w:id="2" w:name="__RefHeading___Toc2078_1190944670"/>
+      <w:bookmarkStart w:id="2" w:name="__RefHeading___Toc2113_726659325"/>
       <w:bookmarkEnd w:id="2"/>
       <w:r>
         <w:rPr/>
@@ -1486,7 +2301,7 @@
             </w:rPr>
             <w:fldChar w:fldCharType="separate"/>
           </w:r>
-          <w:hyperlink w:anchor="__RefHeading___Toc2178_1190944670" w:tooltip="Figure 1.1: The playable game rendered natively and by live StructRender (watercolour)">
+          <w:hyperlink w:anchor="__RefHeading___Toc2213_726659325" w:tooltip="Figure 1.1: The playable game rendered natively and by live StructRender (watercolour)">
             <w:r>
               <w:rPr>
                 <w:rStyle w:val="IndexLink"/>
@@ -1506,7 +2321,7 @@
             </w:tabs>
             <w:rPr/>
           </w:pPr>
-          <w:hyperlink w:anchor="__RefHeading___Toc2194_1190944670" w:tooltip="Figure 3.1: System architecture: offline data and supervision, and the runtime loop">
+          <w:hyperlink w:anchor="__RefHeading___Toc2229_726659325" w:tooltip="Figure 3.1: System architecture: offline data and supervision, and the runtime loop">
             <w:r>
               <w:rPr>
                 <w:rStyle w:val="IndexLink"/>
@@ -1526,7 +2341,7 @@
             </w:tabs>
             <w:rPr/>
           </w:pPr>
-          <w:hyperlink w:anchor="__RefHeading___Toc2192_1190944670" w:tooltip="Figure 3.2: Structural inputs, motion and confidence mask for one test frame">
+          <w:hyperlink w:anchor="__RefHeading___Toc2227_726659325" w:tooltip="Figure 3.2: Structural inputs, motion and confidence mask for one test frame">
             <w:r>
               <w:rPr>
                 <w:rStyle w:val="IndexLink"/>
@@ -1546,7 +2361,7 @@
             </w:tabs>
             <w:rPr/>
           </w:pPr>
-          <w:hyperlink w:anchor="__RefHeading___Toc2190_1190944670" w:tooltip="Figure 3.3: StyleTemporalUNet: style-free encoder, temporal fusion, FiLM decoder">
+          <w:hyperlink w:anchor="__RefHeading___Toc2225_726659325" w:tooltip="Figure 3.3: StyleTemporalUNet: style-free encoder, temporal fusion, FiLM decoder">
             <w:r>
               <w:rPr>
                 <w:rStyle w:val="IndexLink"/>
@@ -1566,7 +2381,7 @@
             </w:tabs>
             <w:rPr/>
           </w:pPr>
-          <w:hyperlink w:anchor="__RefHeading___Toc2188_1190944670" w:tooltip="Figure 4.1: Training objective and validation L1/PSNR of the deployed model">
+          <w:hyperlink w:anchor="__RefHeading___Toc2223_726659325" w:tooltip="Figure 4.1: Training objective and validation L1/PSNR of the deployed model">
             <w:r>
               <w:rPr>
                 <w:rStyle w:val="IndexLink"/>
@@ -1586,7 +2401,7 @@
             </w:tabs>
             <w:rPr/>
           </w:pPr>
-          <w:hyperlink w:anchor="__RefHeading___Toc2186_1190944670" w:tooltip="Figure 4.2: Native input, teacher target and model output for one sealed test frame">
+          <w:hyperlink w:anchor="__RefHeading___Toc2221_726659325" w:tooltip="Figure 4.2: Native input, teacher target and model output for one sealed test frame">
             <w:r>
               <w:rPr>
                 <w:rStyle w:val="IndexLink"/>
@@ -1606,7 +2421,7 @@
             </w:tabs>
             <w:rPr/>
           </w:pPr>
-          <w:hyperlink w:anchor="__RefHeading___Toc2184_1190944670" w:tooltip="Figure 4.3: Live frame rate of the whole loop, and TensorRT latency alone">
+          <w:hyperlink w:anchor="__RefHeading___Toc2219_726659325" w:tooltip="Figure 4.3: Live frame rate of the whole loop, and TensorRT latency alone">
             <w:r>
               <w:rPr>
                 <w:rStyle w:val="IndexLink"/>
@@ -1626,7 +2441,7 @@
             </w:tabs>
             <w:rPr/>
           </w:pPr>
-          <w:hyperlink w:anchor="__RefHeading___Toc2182_1190944670" w:tooltip="Figure C.1: Street scene: the original frame (top left) and 16 visual themes">
+          <w:hyperlink w:anchor="__RefHeading___Toc2217_726659325" w:tooltip="Figure C.1: Street scene: the original frame (top left) and 16 visual themes">
             <w:r>
               <w:rPr>
                 <w:rStyle w:val="IndexLink"/>
@@ -1646,7 +2461,7 @@
             </w:tabs>
             <w:rPr/>
           </w:pPr>
-          <w:hyperlink w:anchor="__RefHeading___Toc2180_1190944670" w:tooltip="Figure C.2: Swinging scene: the original frame (top left) and 16 visual themes">
+          <w:hyperlink w:anchor="__RefHeading___Toc2215_726659325" w:tooltip="Figure C.2: Swinging scene: the original frame (top left) and 16 visual themes">
             <w:r>
               <w:rPr>
                 <w:rStyle w:val="IndexLink"/>
@@ -1679,7 +2494,7 @@
         <w:pStyle w:val="FrontHeading"/>
         <w:rPr/>
       </w:pPr>
-      <w:bookmarkStart w:id="3" w:name="__RefHeading___Toc2080_1190944670"/>
+      <w:bookmarkStart w:id="3" w:name="__RefHeading___Toc2115_726659325"/>
       <w:bookmarkEnd w:id="3"/>
       <w:r>
         <w:rPr/>
@@ -2472,9 +3287,9 @@
     <w:p>
       <w:pPr>
         <w:sectPr>
-          <w:footerReference w:type="even" r:id="rId2"/>
-          <w:footerReference w:type="default" r:id="rId3"/>
-          <w:footerReference w:type="first" r:id="rId4"/>
+          <w:footerReference w:type="even" r:id="rId5"/>
+          <w:footerReference w:type="default" r:id="rId6"/>
+          <w:footerReference w:type="first" r:id="rId7"/>
           <w:type w:val="nextPage"/>
           <w:pgSz w:w="11906" w:h="16838"/>
           <w:pgMar w:left="1440" w:right="1440" w:gutter="0" w:header="0" w:top="1440" w:footer="708" w:bottom="1440"/>
@@ -2490,7 +3305,7 @@
         <w:pStyle w:val="Heading1"/>
         <w:rPr/>
       </w:pPr>
-      <w:bookmarkStart w:id="4" w:name="__RefHeading___Toc2082_1190944670"/>
+      <w:bookmarkStart w:id="4" w:name="__RefHeading___Toc2117_726659325"/>
       <w:bookmarkEnd w:id="4"/>
       <w:r>
         <w:rPr/>
@@ -2502,7 +3317,7 @@
         <w:pStyle w:val="Heading2"/>
         <w:rPr/>
       </w:pPr>
-      <w:bookmarkStart w:id="5" w:name="__RefHeading___Toc2084_1190944670"/>
+      <w:bookmarkStart w:id="5" w:name="__RefHeading___Toc2119_726659325"/>
       <w:bookmarkEnd w:id="5"/>
       <w:r>
         <w:rPr/>
@@ -2565,7 +3380,7 @@
           <wp:inline distT="0" distB="0" distL="0" distR="0">
             <wp:extent cx="5486400" cy="1828800"/>
             <wp:effectExtent l="0" t="0" r="0" b="0"/>
-            <wp:docPr id="1" name="poster_watercolour.png" descr="Figure 1.1: The playable game rendered natively and by live StructRender (watercolour)&#10;Figure 1.1: The playable game rendered natively and by live StructRender (watercolour)"/>
+            <wp:docPr id="4" name="poster_watercolour.png" descr="Figure 1.1: The playable game rendered natively and by live StructRender (watercolour)&#10;Figure 1.1: The playable game rendered natively and by live StructRender (watercolour)"/>
             <wp:cNvGraphicFramePr>
               <a:graphicFrameLocks xmlns:a="http://schemas.openxmlformats.org/drawingml/2006/main" noChangeAspect="1"/>
             </wp:cNvGraphicFramePr>
@@ -2573,13 +3388,13 @@
               <a:graphicData uri="http://schemas.openxmlformats.org/drawingml/2006/picture">
                 <pic:pic xmlns:pic="http://schemas.openxmlformats.org/drawingml/2006/picture">
                   <pic:nvPicPr>
-                    <pic:cNvPr id="1" name="poster_watercolour.png" descr="Figure 1.1: The playable game rendered natively and by live StructRender (watercolour)&#10;Figure 1.1: The playable game rendered natively and by live StructRender (watercolour)"/>
+                    <pic:cNvPr id="4" name="poster_watercolour.png" descr="Figure 1.1: The playable game rendered natively and by live StructRender (watercolour)&#10;Figure 1.1: The playable game rendered natively and by live StructRender (watercolour)"/>
                     <pic:cNvPicPr>
                       <a:picLocks noChangeAspect="1" noChangeArrowheads="1"/>
                     </pic:cNvPicPr>
                   </pic:nvPicPr>
                   <pic:blipFill>
-                    <a:blip r:embed="rId5"/>
+                    <a:blip r:embed="rId8"/>
                     <a:stretch>
                       <a:fillRect/>
                     </a:stretch>
@@ -2606,7 +3421,7 @@
         <w:pStyle w:val="FigureCaption"/>
         <w:rPr/>
       </w:pPr>
-      <w:bookmarkStart w:id="6" w:name="__RefHeading___Toc2178_1190944670"/>
+      <w:bookmarkStart w:id="6" w:name="__RefHeading___Toc2213_726659325"/>
       <w:bookmarkEnd w:id="6"/>
       <w:r>
         <w:rPr>
@@ -2635,7 +3450,7 @@
         <w:pStyle w:val="Heading2"/>
         <w:rPr/>
       </w:pPr>
-      <w:bookmarkStart w:id="7" w:name="__RefHeading___Toc2086_1190944670"/>
+      <w:bookmarkStart w:id="7" w:name="__RefHeading___Toc2121_726659325"/>
       <w:bookmarkEnd w:id="7"/>
       <w:r>
         <w:rPr/>
@@ -2698,7 +3513,7 @@
         <w:pStyle w:val="Heading2"/>
         <w:rPr/>
       </w:pPr>
-      <w:bookmarkStart w:id="8" w:name="__RefHeading___Toc2088_1190944670"/>
+      <w:bookmarkStart w:id="8" w:name="__RefHeading___Toc2123_726659325"/>
       <w:bookmarkEnd w:id="8"/>
       <w:r>
         <w:rPr/>
@@ -2908,7 +3723,7 @@
         <w:pStyle w:val="Heading2"/>
         <w:rPr/>
       </w:pPr>
-      <w:bookmarkStart w:id="9" w:name="__RefHeading___Toc2090_1190944670"/>
+      <w:bookmarkStart w:id="9" w:name="__RefHeading___Toc2125_726659325"/>
       <w:bookmarkEnd w:id="9"/>
       <w:r>
         <w:rPr/>
@@ -2976,7 +3791,7 @@
         <w:pStyle w:val="Heading1"/>
         <w:rPr/>
       </w:pPr>
-      <w:bookmarkStart w:id="10" w:name="__RefHeading___Toc2092_1190944670"/>
+      <w:bookmarkStart w:id="10" w:name="__RefHeading___Toc2127_726659325"/>
       <w:bookmarkEnd w:id="10"/>
       <w:r>
         <w:rPr/>
@@ -2988,7 +3803,7 @@
         <w:pStyle w:val="Heading2"/>
         <w:rPr/>
       </w:pPr>
-      <w:bookmarkStart w:id="11" w:name="__RefHeading___Toc2094_1190944670"/>
+      <w:bookmarkStart w:id="11" w:name="__RefHeading___Toc2129_726659325"/>
       <w:bookmarkEnd w:id="11"/>
       <w:r>
         <w:rPr/>
@@ -3090,7 +3905,7 @@
         <w:pStyle w:val="Heading3"/>
         <w:rPr/>
       </w:pPr>
-      <w:bookmarkStart w:id="12" w:name="__RefHeading___Toc2096_1190944670"/>
+      <w:bookmarkStart w:id="12" w:name="__RefHeading___Toc2131_726659325"/>
       <w:bookmarkEnd w:id="12"/>
       <w:r>
         <w:rPr/>
@@ -3181,7 +3996,7 @@
         <w:keepNext w:val="true"/>
         <w:rPr/>
       </w:pPr>
-      <w:bookmarkStart w:id="13" w:name="__RefHeading___Toc2148_1190944670"/>
+      <w:bookmarkStart w:id="13" w:name="__RefHeading___Toc2183_726659325"/>
       <w:bookmarkEnd w:id="13"/>
       <w:r>
         <w:rPr>
@@ -5255,7 +6070,7 @@
         <w:pStyle w:val="Heading2"/>
         <w:rPr/>
       </w:pPr>
-      <w:bookmarkStart w:id="14" w:name="__RefHeading___Toc2098_1190944670"/>
+      <w:bookmarkStart w:id="14" w:name="__RefHeading___Toc2133_726659325"/>
       <w:bookmarkEnd w:id="14"/>
       <w:r>
         <w:rPr/>
@@ -5278,7 +6093,7 @@
         <w:keepNext w:val="true"/>
         <w:rPr/>
       </w:pPr>
-      <w:bookmarkStart w:id="15" w:name="__RefHeading___Toc2176_1190944670"/>
+      <w:bookmarkStart w:id="15" w:name="__RefHeading___Toc2211_726659325"/>
       <w:bookmarkEnd w:id="15"/>
       <w:r>
         <w:rPr>
@@ -5938,7 +6753,7 @@
         <w:pStyle w:val="Heading1"/>
         <w:rPr/>
       </w:pPr>
-      <w:bookmarkStart w:id="16" w:name="__RefHeading___Toc2100_1190944670"/>
+      <w:bookmarkStart w:id="16" w:name="__RefHeading___Toc2135_726659325"/>
       <w:bookmarkEnd w:id="16"/>
       <w:r>
         <w:rPr/>
@@ -5950,7 +6765,7 @@
         <w:pStyle w:val="Heading2"/>
         <w:rPr/>
       </w:pPr>
-      <w:bookmarkStart w:id="17" w:name="__RefHeading___Toc2102_1190944670"/>
+      <w:bookmarkStart w:id="17" w:name="__RefHeading___Toc2137_726659325"/>
       <w:bookmarkEnd w:id="17"/>
       <w:r>
         <w:rPr/>
@@ -5981,7 +6796,7 @@
           <wp:inline distT="0" distB="0" distL="0" distR="0">
             <wp:extent cx="5667375" cy="4238625"/>
             <wp:effectExtent l="0" t="0" r="0" b="0"/>
-            <wp:docPr id="2" name="architecture.png" descr="Figure 3.1: System architecture: offline data and supervision, and the runtime loop&#10;Figure 3.1: System architecture: offline data and supervision, and the runtime loop"/>
+            <wp:docPr id="5" name="architecture.png" descr="Figure 3.1: System architecture: offline data and supervision, and the runtime loop&#10;Figure 3.1: System architecture: offline data and supervision, and the runtime loop"/>
             <wp:cNvGraphicFramePr>
               <a:graphicFrameLocks xmlns:a="http://schemas.openxmlformats.org/drawingml/2006/main" noChangeAspect="1"/>
             </wp:cNvGraphicFramePr>
@@ -5989,13 +6804,13 @@
               <a:graphicData uri="http://schemas.openxmlformats.org/drawingml/2006/picture">
                 <pic:pic xmlns:pic="http://schemas.openxmlformats.org/drawingml/2006/picture">
                   <pic:nvPicPr>
-                    <pic:cNvPr id="2" name="architecture.png" descr="Figure 3.1: System architecture: offline data and supervision, and the runtime loop&#10;Figure 3.1: System architecture: offline data and supervision, and the runtime loop"/>
+                    <pic:cNvPr id="5" name="architecture.png" descr="Figure 3.1: System architecture: offline data and supervision, and the runtime loop&#10;Figure 3.1: System architecture: offline data and supervision, and the runtime loop"/>
                     <pic:cNvPicPr>
                       <a:picLocks noChangeAspect="1" noChangeArrowheads="1"/>
                     </pic:cNvPicPr>
                   </pic:nvPicPr>
                   <pic:blipFill>
-                    <a:blip r:embed="rId6"/>
+                    <a:blip r:embed="rId9"/>
                     <a:stretch>
                       <a:fillRect/>
                     </a:stretch>
@@ -6022,7 +6837,7 @@
         <w:pStyle w:val="FigureCaption"/>
         <w:rPr/>
       </w:pPr>
-      <w:bookmarkStart w:id="18" w:name="__RefHeading___Toc2194_1190944670"/>
+      <w:bookmarkStart w:id="18" w:name="__RefHeading___Toc2229_726659325"/>
       <w:bookmarkEnd w:id="18"/>
       <w:r>
         <w:rPr>
@@ -6058,9 +6873,7 @@
       </w:r>
       <w:r>
         <w:rPr>
-          <w:rFonts w:eastAsia="Courier New" w:cs="Courier New" w:ascii="Courier New" w:hAnsi="Courier New"/>
-          <w:sz w:val="21"/>
-          <w:szCs w:val="21"/>
+          <w:rFonts w:ascii="Times New Roman" w:hAnsi="Times New Roman" w:cs="Times New Roman" w:eastAsia="Times New Roman"/>
         </w:rPr>
         <w:t>main.tscn</w:t>
       </w:r>
@@ -6169,7 +6982,7 @@
         <w:pStyle w:val="Heading3"/>
         <w:rPr/>
       </w:pPr>
-      <w:bookmarkStart w:id="19" w:name="__RefHeading___Toc2104_1190944670"/>
+      <w:bookmarkStart w:id="19" w:name="__RefHeading___Toc2139_726659325"/>
       <w:bookmarkEnd w:id="19"/>
       <w:r>
         <w:rPr/>
@@ -6214,7 +7027,7 @@
         <w:keepNext w:val="true"/>
         <w:rPr/>
       </w:pPr>
-      <w:bookmarkStart w:id="20" w:name="__RefHeading___Toc2174_1190944670"/>
+      <w:bookmarkStart w:id="20" w:name="__RefHeading___Toc2209_726659325"/>
       <w:bookmarkEnd w:id="20"/>
       <w:r>
         <w:rPr>
@@ -7164,7 +7977,7 @@
         <w:pStyle w:val="Heading3"/>
         <w:rPr/>
       </w:pPr>
-      <w:bookmarkStart w:id="21" w:name="__RefHeading___Toc2106_1190944670"/>
+      <w:bookmarkStart w:id="21" w:name="__RefHeading___Toc2141_726659325"/>
       <w:bookmarkEnd w:id="21"/>
       <w:r>
         <w:rPr/>
@@ -7211,7 +8024,7 @@
         <w:keepNext w:val="true"/>
         <w:rPr/>
       </w:pPr>
-      <w:bookmarkStart w:id="22" w:name="__RefHeading___Toc2172_1190944670"/>
+      <w:bookmarkStart w:id="22" w:name="__RefHeading___Toc2207_726659325"/>
       <w:bookmarkEnd w:id="22"/>
       <w:r>
         <w:rPr>
@@ -7717,7 +8530,7 @@
         <w:keepNext w:val="true"/>
         <w:rPr/>
       </w:pPr>
-      <w:bookmarkStart w:id="23" w:name="__RefHeading___Toc2170_1190944670"/>
+      <w:bookmarkStart w:id="23" w:name="__RefHeading___Toc2205_726659325"/>
       <w:bookmarkEnd w:id="23"/>
       <w:r>
         <w:rPr>
@@ -8561,7 +9374,7 @@
           <wp:inline distT="0" distB="0" distL="0" distR="0">
             <wp:extent cx="5667375" cy="1943100"/>
             <wp:effectExtent l="0" t="0" r="0" b="0"/>
-            <wp:docPr id="3" name="inputs.png" descr="Figure 3.2: Structural inputs, motion and confidence mask for one test frame&#10;Figure 3.2: Structural inputs, motion and confidence mask for one test frame"/>
+            <wp:docPr id="6" name="inputs.png" descr="Figure 3.2: Structural inputs, motion and confidence mask for one test frame&#10;Figure 3.2: Structural inputs, motion and confidence mask for one test frame"/>
             <wp:cNvGraphicFramePr>
               <a:graphicFrameLocks xmlns:a="http://schemas.openxmlformats.org/drawingml/2006/main" noChangeAspect="1"/>
             </wp:cNvGraphicFramePr>
@@ -8569,13 +9382,13 @@
               <a:graphicData uri="http://schemas.openxmlformats.org/drawingml/2006/picture">
                 <pic:pic xmlns:pic="http://schemas.openxmlformats.org/drawingml/2006/picture">
                   <pic:nvPicPr>
-                    <pic:cNvPr id="3" name="inputs.png" descr="Figure 3.2: Structural inputs, motion and confidence mask for one test frame&#10;Figure 3.2: Structural inputs, motion and confidence mask for one test frame"/>
+                    <pic:cNvPr id="6" name="inputs.png" descr="Figure 3.2: Structural inputs, motion and confidence mask for one test frame&#10;Figure 3.2: Structural inputs, motion and confidence mask for one test frame"/>
                     <pic:cNvPicPr>
                       <a:picLocks noChangeAspect="1" noChangeArrowheads="1"/>
                     </pic:cNvPicPr>
                   </pic:nvPicPr>
                   <pic:blipFill>
-                    <a:blip r:embed="rId7"/>
+                    <a:blip r:embed="rId10"/>
                     <a:stretch>
                       <a:fillRect/>
                     </a:stretch>
@@ -8602,7 +9415,7 @@
         <w:pStyle w:val="FigureCaption"/>
         <w:rPr/>
       </w:pPr>
-      <w:bookmarkStart w:id="24" w:name="__RefHeading___Toc2192_1190944670"/>
+      <w:bookmarkStart w:id="24" w:name="__RefHeading___Toc2227_726659325"/>
       <w:bookmarkEnd w:id="24"/>
       <w:r>
         <w:rPr>
@@ -8621,7 +9434,7 @@
         <w:pStyle w:val="Heading3"/>
         <w:rPr/>
       </w:pPr>
-      <w:bookmarkStart w:id="25" w:name="__RefHeading___Toc2108_1190944670"/>
+      <w:bookmarkStart w:id="25" w:name="__RefHeading___Toc2143_726659325"/>
       <w:bookmarkEnd w:id="25"/>
       <w:r>
         <w:rPr/>
@@ -8670,7 +9483,7 @@
           <wp:inline distT="0" distB="0" distL="0" distR="0">
             <wp:extent cx="5486400" cy="3629025"/>
             <wp:effectExtent l="0" t="0" r="0" b="0"/>
-            <wp:docPr id="4" name="network.png" descr="Figure 3.3: StyleTemporalUNet: style-free encoder, temporal fusion, FiLM decoder&#10;Figure 3.3: StyleTemporalUNet: style-free encoder, temporal fusion, FiLM decoder"/>
+            <wp:docPr id="7" name="network.png" descr="Figure 3.3: StyleTemporalUNet: style-free encoder, temporal fusion, FiLM decoder&#10;Figure 3.3: StyleTemporalUNet: style-free encoder, temporal fusion, FiLM decoder"/>
             <wp:cNvGraphicFramePr>
               <a:graphicFrameLocks xmlns:a="http://schemas.openxmlformats.org/drawingml/2006/main" noChangeAspect="1"/>
             </wp:cNvGraphicFramePr>
@@ -8678,13 +9491,13 @@
               <a:graphicData uri="http://schemas.openxmlformats.org/drawingml/2006/picture">
                 <pic:pic xmlns:pic="http://schemas.openxmlformats.org/drawingml/2006/picture">
                   <pic:nvPicPr>
-                    <pic:cNvPr id="4" name="network.png" descr="Figure 3.3: StyleTemporalUNet: style-free encoder, temporal fusion, FiLM decoder&#10;Figure 3.3: StyleTemporalUNet: style-free encoder, temporal fusion, FiLM decoder"/>
+                    <pic:cNvPr id="7" name="network.png" descr="Figure 3.3: StyleTemporalUNet: style-free encoder, temporal fusion, FiLM decoder&#10;Figure 3.3: StyleTemporalUNet: style-free encoder, temporal fusion, FiLM decoder"/>
                     <pic:cNvPicPr>
                       <a:picLocks noChangeAspect="1" noChangeArrowheads="1"/>
                     </pic:cNvPicPr>
                   </pic:nvPicPr>
                   <pic:blipFill>
-                    <a:blip r:embed="rId8"/>
+                    <a:blip r:embed="rId11"/>
                     <a:stretch>
                       <a:fillRect/>
                     </a:stretch>
@@ -8711,7 +9524,7 @@
         <w:pStyle w:val="FigureCaption"/>
         <w:rPr/>
       </w:pPr>
-      <w:bookmarkStart w:id="26" w:name="__RefHeading___Toc2190_1190944670"/>
+      <w:bookmarkStart w:id="26" w:name="__RefHeading___Toc2225_726659325"/>
       <w:bookmarkEnd w:id="26"/>
       <w:r>
         <w:rPr>
@@ -8987,7 +9800,7 @@
         <w:keepNext w:val="true"/>
         <w:rPr/>
       </w:pPr>
-      <w:bookmarkStart w:id="27" w:name="__RefHeading___Toc2168_1190944670"/>
+      <w:bookmarkStart w:id="27" w:name="__RefHeading___Toc2203_726659325"/>
       <w:bookmarkEnd w:id="27"/>
       <w:r>
         <w:rPr>
@@ -9953,7 +10766,7 @@
         <w:pStyle w:val="Heading2"/>
         <w:rPr/>
       </w:pPr>
-      <w:bookmarkStart w:id="28" w:name="__RefHeading___Toc2110_1190944670"/>
+      <w:bookmarkStart w:id="28" w:name="__RefHeading___Toc2145_726659325"/>
       <w:bookmarkEnd w:id="28"/>
       <w:r>
         <w:rPr/>
@@ -9976,7 +10789,7 @@
         <w:keepNext w:val="true"/>
         <w:rPr/>
       </w:pPr>
-      <w:bookmarkStart w:id="29" w:name="__RefHeading___Toc2166_1190944670"/>
+      <w:bookmarkStart w:id="29" w:name="__RefHeading___Toc2201_726659325"/>
       <w:bookmarkEnd w:id="29"/>
       <w:r>
         <w:rPr>
@@ -10127,7 +10940,7 @@
                 <w:sz w:val="19"/>
                 <w:szCs w:val="19"/>
               </w:rPr>
-              <w:t>Laptop — make and model [DETAILS REQUIRED]</w:t>
+              <w:t>ASUS ROG Strix G16 (2025) laptop</w:t>
             </w:r>
           </w:p>
         </w:tc>
@@ -10453,7 +11266,7 @@
         <w:pStyle w:val="Heading2"/>
         <w:rPr/>
       </w:pPr>
-      <w:bookmarkStart w:id="30" w:name="__RefHeading___Toc2112_1190944670"/>
+      <w:bookmarkStart w:id="30" w:name="__RefHeading___Toc2147_726659325"/>
       <w:bookmarkEnd w:id="30"/>
       <w:r>
         <w:rPr/>
@@ -10466,7 +11279,7 @@
         <w:keepNext w:val="true"/>
         <w:rPr/>
       </w:pPr>
-      <w:bookmarkStart w:id="31" w:name="__RefHeading___Toc2164_1190944670"/>
+      <w:bookmarkStart w:id="31" w:name="__RefHeading___Toc2199_726659325"/>
       <w:bookmarkEnd w:id="31"/>
       <w:r>
         <w:rPr>
@@ -11136,7 +11949,7 @@
         <w:pStyle w:val="Heading1"/>
         <w:rPr/>
       </w:pPr>
-      <w:bookmarkStart w:id="32" w:name="__RefHeading___Toc2114_1190944670"/>
+      <w:bookmarkStart w:id="32" w:name="__RefHeading___Toc2149_726659325"/>
       <w:bookmarkEnd w:id="32"/>
       <w:r>
         <w:rPr/>
@@ -11148,7 +11961,7 @@
         <w:pStyle w:val="Heading2"/>
         <w:rPr/>
       </w:pPr>
-      <w:bookmarkStart w:id="33" w:name="__RefHeading___Toc2116_1190944670"/>
+      <w:bookmarkStart w:id="33" w:name="__RefHeading___Toc2151_726659325"/>
       <w:bookmarkEnd w:id="33"/>
       <w:r>
         <w:rPr/>
@@ -11166,9 +11979,7 @@
       </w:r>
       <w:r>
         <w:rPr>
-          <w:rFonts w:eastAsia="Courier New" w:cs="Courier New" w:ascii="Courier New" w:hAnsi="Courier New"/>
-          <w:sz w:val="21"/>
-          <w:szCs w:val="21"/>
+          <w:rFonts w:ascii="Times New Roman" w:hAnsi="Times New Roman" w:cs="Times New Roman" w:eastAsia="Times New Roman"/>
         </w:rPr>
         <w:t>configs/game/model_b_two_style.json</w:t>
       </w:r>
@@ -11183,7 +11994,7 @@
         <w:keepNext w:val="true"/>
         <w:rPr/>
       </w:pPr>
-      <w:bookmarkStart w:id="34" w:name="__RefHeading___Toc2162_1190944670"/>
+      <w:bookmarkStart w:id="34" w:name="__RefHeading___Toc2197_726659325"/>
       <w:bookmarkEnd w:id="34"/>
       <w:r>
         <w:rPr>
@@ -11843,7 +12654,7 @@
         <w:pStyle w:val="Heading2"/>
         <w:rPr/>
       </w:pPr>
-      <w:bookmarkStart w:id="35" w:name="__RefHeading___Toc2118_1190944670"/>
+      <w:bookmarkStart w:id="35" w:name="__RefHeading___Toc2153_726659325"/>
       <w:bookmarkEnd w:id="35"/>
       <w:r>
         <w:rPr/>
@@ -12539,7 +13350,7 @@
         <w:pStyle w:val="Heading2"/>
         <w:rPr/>
       </w:pPr>
-      <w:bookmarkStart w:id="36" w:name="__RefHeading___Toc2120_1190944670"/>
+      <w:bookmarkStart w:id="36" w:name="__RefHeading___Toc2155_726659325"/>
       <w:bookmarkEnd w:id="36"/>
       <w:r>
         <w:rPr/>
@@ -12551,7 +13362,7 @@
         <w:pStyle w:val="Heading3"/>
         <w:rPr/>
       </w:pPr>
-      <w:bookmarkStart w:id="37" w:name="__RefHeading___Toc2122_1190944670"/>
+      <w:bookmarkStart w:id="37" w:name="__RefHeading___Toc2157_726659325"/>
       <w:bookmarkEnd w:id="37"/>
       <w:r>
         <w:rPr/>
@@ -12582,7 +13393,7 @@
           <wp:inline distT="0" distB="0" distL="0" distR="0">
             <wp:extent cx="5667375" cy="1876425"/>
             <wp:effectExtent l="0" t="0" r="0" b="0"/>
-            <wp:docPr id="5" name="training.png" descr="Figure 4.1: Training objective and validation L1/PSNR of the deployed model&#10;Figure 4.1: Training objective and validation L1/PSNR of the deployed model"/>
+            <wp:docPr id="8" name="training.png" descr="Figure 4.1: Training objective and validation L1/PSNR of the deployed model&#10;Figure 4.1: Training objective and validation L1/PSNR of the deployed model"/>
             <wp:cNvGraphicFramePr>
               <a:graphicFrameLocks xmlns:a="http://schemas.openxmlformats.org/drawingml/2006/main" noChangeAspect="1"/>
             </wp:cNvGraphicFramePr>
@@ -12590,13 +13401,13 @@
               <a:graphicData uri="http://schemas.openxmlformats.org/drawingml/2006/picture">
                 <pic:pic xmlns:pic="http://schemas.openxmlformats.org/drawingml/2006/picture">
                   <pic:nvPicPr>
-                    <pic:cNvPr id="5" name="training.png" descr="Figure 4.1: Training objective and validation L1/PSNR of the deployed model&#10;Figure 4.1: Training objective and validation L1/PSNR of the deployed model"/>
+                    <pic:cNvPr id="8" name="training.png" descr="Figure 4.1: Training objective and validation L1/PSNR of the deployed model&#10;Figure 4.1: Training objective and validation L1/PSNR of the deployed model"/>
                     <pic:cNvPicPr>
                       <a:picLocks noChangeAspect="1" noChangeArrowheads="1"/>
                     </pic:cNvPicPr>
                   </pic:nvPicPr>
                   <pic:blipFill>
-                    <a:blip r:embed="rId9"/>
+                    <a:blip r:embed="rId12"/>
                     <a:stretch>
                       <a:fillRect/>
                     </a:stretch>
@@ -12623,7 +13434,7 @@
         <w:pStyle w:val="FigureCaption"/>
         <w:rPr/>
       </w:pPr>
-      <w:bookmarkStart w:id="38" w:name="__RefHeading___Toc2188_1190944670"/>
+      <w:bookmarkStart w:id="38" w:name="__RefHeading___Toc2223_726659325"/>
       <w:bookmarkEnd w:id="38"/>
       <w:r>
         <w:rPr>
@@ -12642,7 +13453,7 @@
         <w:pStyle w:val="Heading3"/>
         <w:rPr/>
       </w:pPr>
-      <w:bookmarkStart w:id="39" w:name="__RefHeading___Toc2124_1190944670"/>
+      <w:bookmarkStart w:id="39" w:name="__RefHeading___Toc2159_726659325"/>
       <w:bookmarkEnd w:id="39"/>
       <w:r>
         <w:rPr/>
@@ -12665,7 +13476,7 @@
         <w:keepNext w:val="true"/>
         <w:rPr/>
       </w:pPr>
-      <w:bookmarkStart w:id="40" w:name="__RefHeading___Toc2160_1190944670"/>
+      <w:bookmarkStart w:id="40" w:name="__RefHeading___Toc2195_726659325"/>
       <w:bookmarkEnd w:id="40"/>
       <w:r>
         <w:rPr>
@@ -14361,7 +15172,7 @@
         <w:pStyle w:val="Heading3"/>
         <w:rPr/>
       </w:pPr>
-      <w:bookmarkStart w:id="41" w:name="__RefHeading___Toc2126_1190944670"/>
+      <w:bookmarkStart w:id="41" w:name="__RefHeading___Toc2161_726659325"/>
       <w:bookmarkEnd w:id="41"/>
       <w:r>
         <w:rPr/>
@@ -14374,7 +15185,7 @@
         <w:keepNext w:val="true"/>
         <w:rPr/>
       </w:pPr>
-      <w:bookmarkStart w:id="42" w:name="__RefHeading___Toc2158_1190944670"/>
+      <w:bookmarkStart w:id="42" w:name="__RefHeading___Toc2193_726659325"/>
       <w:bookmarkEnd w:id="42"/>
       <w:r>
         <w:rPr>
@@ -15437,7 +16248,7 @@
           <wp:inline distT="0" distB="0" distL="0" distR="0">
             <wp:extent cx="5124450" cy="2181225"/>
             <wp:effectExtent l="0" t="0" r="0" b="0"/>
-            <wp:docPr id="6" name="qualitative.png" descr="Figure 4.2: Native input, teacher target and model output for one sealed test frame&#10;Figure 4.2: Native input, teacher target and model output for one sealed test frame"/>
+            <wp:docPr id="9" name="qualitative.png" descr="Figure 4.2: Native input, teacher target and model output for one sealed test frame&#10;Figure 4.2: Native input, teacher target and model output for one sealed test frame"/>
             <wp:cNvGraphicFramePr>
               <a:graphicFrameLocks xmlns:a="http://schemas.openxmlformats.org/drawingml/2006/main" noChangeAspect="1"/>
             </wp:cNvGraphicFramePr>
@@ -15445,13 +16256,13 @@
               <a:graphicData uri="http://schemas.openxmlformats.org/drawingml/2006/picture">
                 <pic:pic xmlns:pic="http://schemas.openxmlformats.org/drawingml/2006/picture">
                   <pic:nvPicPr>
-                    <pic:cNvPr id="6" name="qualitative.png" descr="Figure 4.2: Native input, teacher target and model output for one sealed test frame&#10;Figure 4.2: Native input, teacher target and model output for one sealed test frame"/>
+                    <pic:cNvPr id="9" name="qualitative.png" descr="Figure 4.2: Native input, teacher target and model output for one sealed test frame&#10;Figure 4.2: Native input, teacher target and model output for one sealed test frame"/>
                     <pic:cNvPicPr>
                       <a:picLocks noChangeAspect="1" noChangeArrowheads="1"/>
                     </pic:cNvPicPr>
                   </pic:nvPicPr>
                   <pic:blipFill>
-                    <a:blip r:embed="rId10"/>
+                    <a:blip r:embed="rId13"/>
                     <a:stretch>
                       <a:fillRect/>
                     </a:stretch>
@@ -15478,7 +16289,7 @@
         <w:pStyle w:val="FigureCaption"/>
         <w:rPr/>
       </w:pPr>
-      <w:bookmarkStart w:id="43" w:name="__RefHeading___Toc2186_1190944670"/>
+      <w:bookmarkStart w:id="43" w:name="__RefHeading___Toc2221_726659325"/>
       <w:bookmarkEnd w:id="43"/>
       <w:r>
         <w:rPr>
@@ -15514,7 +16325,7 @@
         <w:pStyle w:val="Heading3"/>
         <w:rPr/>
       </w:pPr>
-      <w:bookmarkStart w:id="44" w:name="__RefHeading___Toc2128_1190944670"/>
+      <w:bookmarkStart w:id="44" w:name="__RefHeading___Toc2163_726659325"/>
       <w:bookmarkEnd w:id="44"/>
       <w:r>
         <w:rPr/>
@@ -15537,7 +16348,7 @@
         <w:keepNext w:val="true"/>
         <w:rPr/>
       </w:pPr>
-      <w:bookmarkStart w:id="45" w:name="__RefHeading___Toc2156_1190944670"/>
+      <w:bookmarkStart w:id="45" w:name="__RefHeading___Toc2191_726659325"/>
       <w:bookmarkEnd w:id="45"/>
       <w:r>
         <w:rPr>
@@ -16010,7 +16821,7 @@
           <wp:inline distT="0" distB="0" distL="0" distR="0">
             <wp:extent cx="5305425" cy="1524000"/>
             <wp:effectExtent l="0" t="0" r="0" b="0"/>
-            <wp:docPr id="7" name="live.png" descr="Figure 4.3: Live frame rate of the whole loop, and TensorRT latency alone&#10;Figure 4.3: Live frame rate of the whole loop, and TensorRT latency alone"/>
+            <wp:docPr id="10" name="live.png" descr="Figure 4.3: Live frame rate of the whole loop, and TensorRT latency alone&#10;Figure 4.3: Live frame rate of the whole loop, and TensorRT latency alone"/>
             <wp:cNvGraphicFramePr>
               <a:graphicFrameLocks xmlns:a="http://schemas.openxmlformats.org/drawingml/2006/main" noChangeAspect="1"/>
             </wp:cNvGraphicFramePr>
@@ -16018,13 +16829,13 @@
               <a:graphicData uri="http://schemas.openxmlformats.org/drawingml/2006/picture">
                 <pic:pic xmlns:pic="http://schemas.openxmlformats.org/drawingml/2006/picture">
                   <pic:nvPicPr>
-                    <pic:cNvPr id="7" name="live.png" descr="Figure 4.3: Live frame rate of the whole loop, and TensorRT latency alone&#10;Figure 4.3: Live frame rate of the whole loop, and TensorRT latency alone"/>
+                    <pic:cNvPr id="10" name="live.png" descr="Figure 4.3: Live frame rate of the whole loop, and TensorRT latency alone&#10;Figure 4.3: Live frame rate of the whole loop, and TensorRT latency alone"/>
                     <pic:cNvPicPr>
                       <a:picLocks noChangeAspect="1" noChangeArrowheads="1"/>
                     </pic:cNvPicPr>
                   </pic:nvPicPr>
                   <pic:blipFill>
-                    <a:blip r:embed="rId11"/>
+                    <a:blip r:embed="rId14"/>
                     <a:stretch>
                       <a:fillRect/>
                     </a:stretch>
@@ -16051,7 +16862,7 @@
         <w:pStyle w:val="FigureCaption"/>
         <w:rPr/>
       </w:pPr>
-      <w:bookmarkStart w:id="46" w:name="__RefHeading___Toc2184_1190944670"/>
+      <w:bookmarkStart w:id="46" w:name="__RefHeading___Toc2219_726659325"/>
       <w:bookmarkEnd w:id="46"/>
       <w:r>
         <w:rPr>
@@ -16071,7 +16882,7 @@
         <w:keepNext w:val="true"/>
         <w:rPr/>
       </w:pPr>
-      <w:bookmarkStart w:id="47" w:name="__RefHeading___Toc2154_1190944670"/>
+      <w:bookmarkStart w:id="47" w:name="__RefHeading___Toc2189_726659325"/>
       <w:bookmarkEnd w:id="47"/>
       <w:r>
         <w:rPr>
@@ -16580,7 +17391,7 @@
         <w:pStyle w:val="Heading3"/>
         <w:rPr/>
       </w:pPr>
-      <w:bookmarkStart w:id="48" w:name="__RefHeading___Toc2130_1190944670"/>
+      <w:bookmarkStart w:id="48" w:name="__RefHeading___Toc2165_726659325"/>
       <w:bookmarkEnd w:id="48"/>
       <w:r>
         <w:rPr/>
@@ -16593,7 +17404,7 @@
         <w:keepNext w:val="true"/>
         <w:rPr/>
       </w:pPr>
-      <w:bookmarkStart w:id="49" w:name="__RefHeading___Toc2152_1190944670"/>
+      <w:bookmarkStart w:id="49" w:name="__RefHeading___Toc2187_726659325"/>
       <w:bookmarkEnd w:id="49"/>
       <w:r>
         <w:rPr>
@@ -17449,7 +18260,7 @@
         <w:pStyle w:val="Heading1"/>
         <w:rPr/>
       </w:pPr>
-      <w:bookmarkStart w:id="50" w:name="__RefHeading___Toc2132_1190944670"/>
+      <w:bookmarkStart w:id="50" w:name="__RefHeading___Toc2167_726659325"/>
       <w:bookmarkEnd w:id="50"/>
       <w:r>
         <w:rPr/>
@@ -17461,7 +18272,7 @@
         <w:pStyle w:val="Heading2"/>
         <w:rPr/>
       </w:pPr>
-      <w:bookmarkStart w:id="51" w:name="__RefHeading___Toc2134_1190944670"/>
+      <w:bookmarkStart w:id="51" w:name="__RefHeading___Toc2169_726659325"/>
       <w:bookmarkEnd w:id="51"/>
       <w:r>
         <w:rPr/>
@@ -17578,7 +18389,7 @@
         <w:pStyle w:val="Heading2"/>
         <w:rPr/>
       </w:pPr>
-      <w:bookmarkStart w:id="52" w:name="__RefHeading___Toc2136_1190944670"/>
+      <w:bookmarkStart w:id="52" w:name="__RefHeading___Toc2171_726659325"/>
       <w:bookmarkEnd w:id="52"/>
       <w:r>
         <w:rPr/>
@@ -17674,7 +18485,7 @@
         <w:pStyle w:val="BackHeading"/>
         <w:rPr/>
       </w:pPr>
-      <w:bookmarkStart w:id="53" w:name="__RefHeading___Toc2138_1190944670"/>
+      <w:bookmarkStart w:id="53" w:name="__RefHeading___Toc2173_726659325"/>
       <w:bookmarkEnd w:id="53"/>
       <w:r>
         <w:rPr/>
@@ -18262,7 +19073,7 @@
         <w:pStyle w:val="BackHeading"/>
         <w:rPr/>
       </w:pPr>
-      <w:bookmarkStart w:id="54" w:name="__RefHeading___Toc2140_1190944670"/>
+      <w:bookmarkStart w:id="54" w:name="__RefHeading___Toc2175_726659325"/>
       <w:bookmarkEnd w:id="54"/>
       <w:r>
         <w:rPr/>
@@ -18274,7 +19085,7 @@
         <w:pStyle w:val="Heading2"/>
         <w:rPr/>
       </w:pPr>
-      <w:bookmarkStart w:id="55" w:name="__RefHeading___Toc2142_1190944670"/>
+      <w:bookmarkStart w:id="55" w:name="__RefHeading___Toc2177_726659325"/>
       <w:bookmarkEnd w:id="55"/>
       <w:r>
         <w:rPr/>
@@ -18483,9 +19294,7 @@
       </w:r>
       <w:r>
         <w:rPr>
-          <w:rFonts w:eastAsia="Courier New" w:cs="Courier New" w:ascii="Courier New" w:hAnsi="Courier New"/>
-          <w:sz w:val="21"/>
-          <w:szCs w:val="21"/>
+          <w:rFonts w:ascii="Times New Roman" w:hAnsi="Times New Roman" w:cs="Times New Roman" w:eastAsia="Times New Roman"/>
         </w:rPr>
         <w:t>eval/reports/</w:t>
       </w:r>
@@ -18495,9 +19304,7 @@
       </w:r>
       <w:r>
         <w:rPr>
-          <w:rFonts w:eastAsia="Courier New" w:cs="Courier New" w:ascii="Courier New" w:hAnsi="Courier New"/>
-          <w:sz w:val="21"/>
-          <w:szCs w:val="21"/>
+          <w:rFonts w:ascii="Times New Roman" w:hAnsi="Times New Roman" w:cs="Times New Roman" w:eastAsia="Times New Roman"/>
         </w:rPr>
         <w:t>eval/logs/</w:t>
       </w:r>
@@ -18507,9 +19314,7 @@
       </w:r>
       <w:r>
         <w:rPr>
-          <w:rFonts w:eastAsia="Courier New" w:cs="Courier New" w:ascii="Courier New" w:hAnsi="Courier New"/>
-          <w:sz w:val="21"/>
-          <w:szCs w:val="21"/>
+          <w:rFonts w:ascii="Times New Roman" w:hAnsi="Times New Roman" w:cs="Times New Roman" w:eastAsia="Times New Roman"/>
         </w:rPr>
         <w:t>docs/StructRender_KB.md</w:t>
       </w:r>
@@ -18523,7 +19328,7 @@
         <w:pStyle w:val="Heading2"/>
         <w:rPr/>
       </w:pPr>
-      <w:bookmarkStart w:id="56" w:name="__RefHeading___Toc2144_1190944670"/>
+      <w:bookmarkStart w:id="56" w:name="__RefHeading___Toc2179_726659325"/>
       <w:bookmarkEnd w:id="56"/>
       <w:r>
         <w:rPr/>
@@ -18536,7 +19341,7 @@
         <w:keepNext w:val="true"/>
         <w:rPr/>
       </w:pPr>
-      <w:bookmarkStart w:id="57" w:name="__RefHeading___Toc2150_1190944670"/>
+      <w:bookmarkStart w:id="57" w:name="__RefHeading___Toc2185_726659325"/>
       <w:bookmarkEnd w:id="57"/>
       <w:r>
         <w:rPr>
@@ -19298,7 +20103,7 @@
         <w:pStyle w:val="Heading2"/>
         <w:rPr/>
       </w:pPr>
-      <w:bookmarkStart w:id="58" w:name="__RefHeading___Toc2146_1190944670"/>
+      <w:bookmarkStart w:id="58" w:name="__RefHeading___Toc2181_726659325"/>
       <w:bookmarkEnd w:id="58"/>
       <w:r>
         <w:rPr/>
@@ -19316,9 +20121,7 @@
       </w:r>
       <w:r>
         <w:rPr>
-          <w:rFonts w:eastAsia="Courier New" w:cs="Courier New" w:ascii="Courier New" w:hAnsi="Courier New"/>
-          <w:sz w:val="21"/>
-          <w:szCs w:val="21"/>
+          <w:rFonts w:ascii="Times New Roman" w:hAnsi="Times New Roman" w:cs="Times New Roman" w:eastAsia="Times New Roman"/>
         </w:rPr>
         <w:t>docs/screenshots/</w:t>
       </w:r>
@@ -19341,7 +20144,7 @@
           <wp:inline distT="0" distB="0" distL="0" distR="0">
             <wp:extent cx="5667375" cy="4029075"/>
             <wp:effectExtent l="0" t="0" r="0" b="0"/>
-            <wp:docPr id="8" name="collage_street.jpg" descr="Figure C.1: Street scene: the original frame (top left) and 16 visual themes&#10;Figure C.1: Street scene: the original frame (top left) and 16 visual themes"/>
+            <wp:docPr id="11" name="collage_street.jpg" descr="Figure C.1: Street scene: the original frame (top left) and 16 visual themes&#10;Figure C.1: Street scene: the original frame (top left) and 16 visual themes"/>
             <wp:cNvGraphicFramePr>
               <a:graphicFrameLocks xmlns:a="http://schemas.openxmlformats.org/drawingml/2006/main" noChangeAspect="1"/>
             </wp:cNvGraphicFramePr>
@@ -19349,13 +20152,13 @@
               <a:graphicData uri="http://schemas.openxmlformats.org/drawingml/2006/picture">
                 <pic:pic xmlns:pic="http://schemas.openxmlformats.org/drawingml/2006/picture">
                   <pic:nvPicPr>
-                    <pic:cNvPr id="8" name="collage_street.jpg" descr="Figure C.1: Street scene: the original frame (top left) and 16 visual themes&#10;Figure C.1: Street scene: the original frame (top left) and 16 visual themes"/>
+                    <pic:cNvPr id="11" name="collage_street.jpg" descr="Figure C.1: Street scene: the original frame (top left) and 16 visual themes&#10;Figure C.1: Street scene: the original frame (top left) and 16 visual themes"/>
                     <pic:cNvPicPr>
                       <a:picLocks noChangeAspect="1" noChangeArrowheads="1"/>
                     </pic:cNvPicPr>
                   </pic:nvPicPr>
                   <pic:blipFill>
-                    <a:blip r:embed="rId12"/>
+                    <a:blip r:embed="rId15"/>
                     <a:stretch>
                       <a:fillRect/>
                     </a:stretch>
@@ -19382,7 +20185,7 @@
         <w:pStyle w:val="FigureCaption"/>
         <w:rPr/>
       </w:pPr>
-      <w:bookmarkStart w:id="59" w:name="__RefHeading___Toc2182_1190944670"/>
+      <w:bookmarkStart w:id="59" w:name="__RefHeading___Toc2217_726659325"/>
       <w:bookmarkEnd w:id="59"/>
       <w:r>
         <w:rPr>
@@ -19410,7 +20213,7 @@
           <wp:inline distT="0" distB="0" distL="0" distR="0">
             <wp:extent cx="5667375" cy="4029075"/>
             <wp:effectExtent l="0" t="0" r="0" b="0"/>
-            <wp:docPr id="9" name="collage_swing.jpg" descr="Figure C.2: Swinging scene: the original frame (top left) and 16 visual themes&#10;Figure C.2: Swinging scene: the original frame (top left) and 16 visual themes"/>
+            <wp:docPr id="12" name="collage_swing.jpg" descr="Figure C.2: Swinging scene: the original frame (top left) and 16 visual themes&#10;Figure C.2: Swinging scene: the original frame (top left) and 16 visual themes"/>
             <wp:cNvGraphicFramePr>
               <a:graphicFrameLocks xmlns:a="http://schemas.openxmlformats.org/drawingml/2006/main" noChangeAspect="1"/>
             </wp:cNvGraphicFramePr>
@@ -19418,13 +20221,13 @@
               <a:graphicData uri="http://schemas.openxmlformats.org/drawingml/2006/picture">
                 <pic:pic xmlns:pic="http://schemas.openxmlformats.org/drawingml/2006/picture">
                   <pic:nvPicPr>
-                    <pic:cNvPr id="9" name="collage_swing.jpg" descr="Figure C.2: Swinging scene: the original frame (top left) and 16 visual themes&#10;Figure C.2: Swinging scene: the original frame (top left) and 16 visual themes"/>
+                    <pic:cNvPr id="12" name="collage_swing.jpg" descr="Figure C.2: Swinging scene: the original frame (top left) and 16 visual themes&#10;Figure C.2: Swinging scene: the original frame (top left) and 16 visual themes"/>
                     <pic:cNvPicPr>
                       <a:picLocks noChangeAspect="1" noChangeArrowheads="1"/>
                     </pic:cNvPicPr>
                   </pic:nvPicPr>
                   <pic:blipFill>
-                    <a:blip r:embed="rId13"/>
+                    <a:blip r:embed="rId16"/>
                     <a:stretch>
                       <a:fillRect/>
                     </a:stretch>
@@ -19453,7 +20256,7 @@
         <w:jc w:val="center"/>
         <w:rPr/>
       </w:pPr>
-      <w:bookmarkStart w:id="60" w:name="__RefHeading___Toc2180_1190944670"/>
+      <w:bookmarkStart w:id="60" w:name="__RefHeading___Toc2215_726659325"/>
       <w:bookmarkEnd w:id="60"/>
       <w:r>
         <w:rPr>
@@ -19468,9 +20271,9 @@
       </w:r>
     </w:p>
     <w:sectPr>
-      <w:footerReference w:type="even" r:id="rId14"/>
-      <w:footerReference w:type="default" r:id="rId15"/>
-      <w:footerReference w:type="first" r:id="rId16"/>
+      <w:footerReference w:type="even" r:id="rId17"/>
+      <w:footerReference w:type="default" r:id="rId18"/>
+      <w:footerReference w:type="first" r:id="rId19"/>
       <w:type w:val="nextPage"/>
       <w:pgSz w:w="11906" w:h="16838"/>
       <w:pgMar w:left="1440" w:right="1440" w:gutter="0" w:header="0" w:top="1440" w:footer="708" w:bottom="1440"/>
@@ -19762,7 +20565,7 @@
     <w:lvl w:ilvl="0">
       <w:start w:val="1"/>
       <w:numFmt w:val="bullet"/>
-      <w:lvlText w:val=""/>
+      <w:lvlText w:val="•"/>
       <w:lvlJc w:val="left"/>
       <w:pPr>
         <w:tabs>
@@ -19771,7 +20574,7 @@
         <w:ind w:left="567" w:hanging="340"/>
       </w:pPr>
       <w:rPr>
-        <w:rFonts w:ascii="Symbol" w:hAnsi="Symbol" w:cs="Symbol" w:hint="default"/>
+        <w:rFonts w:ascii="Times New Roman" w:hAnsi="Times New Roman" w:cs="Times New Roman" w:eastAsia="Times New Roman"/>
       </w:rPr>
     </w:lvl>
     <w:lvl w:ilvl="1">
@@ -20139,7 +20942,7 @@
   <w:docDefaults>
     <w:rPrDefault>
       <w:rPr>
-        <w:rFonts w:ascii="Times New Roman" w:hAnsi="Times New Roman" w:eastAsia="Times New Roman" w:cs="Times New Roman"/>
+        <w:rFonts w:ascii="Times New Roman" w:hAnsi="Times New Roman" w:cs="Times New Roman" w:eastAsia="Times New Roman"/>
         <w:sz w:val="24"/>
         <w:szCs w:val="24"/>
         <w:lang w:val="en-US" w:eastAsia="zh-CN" w:bidi="hi-IN"/>
@@ -20160,7 +20963,7 @@
       <w:jc w:val="both"/>
     </w:pPr>
     <w:rPr>
-      <w:rFonts w:ascii="Times New Roman" w:hAnsi="Times New Roman" w:eastAsia="Times New Roman" w:cs="Times New Roman"/>
+      <w:rFonts w:ascii="Times New Roman" w:hAnsi="Times New Roman" w:cs="Times New Roman" w:eastAsia="Times New Roman"/>
       <w:color w:val="auto"/>
       <w:kern w:val="0"/>
       <w:sz w:val="24"/>
@@ -20180,7 +20983,7 @@
       <w:outlineLvl w:val="0"/>
     </w:pPr>
     <w:rPr>
-      <w:rFonts w:ascii="Times New Roman" w:hAnsi="Times New Roman" w:eastAsia="Times New Roman" w:cs="Times New Roman"/>
+      <w:rFonts w:ascii="Times New Roman" w:hAnsi="Times New Roman" w:cs="Times New Roman" w:eastAsia="Times New Roman"/>
       <w:b/>
       <w:bCs/>
       <w:sz w:val="32"/>
@@ -20198,7 +21001,7 @@
       <w:outlineLvl w:val="1"/>
     </w:pPr>
     <w:rPr>
-      <w:rFonts w:ascii="Times New Roman" w:hAnsi="Times New Roman" w:eastAsia="Times New Roman" w:cs="Times New Roman"/>
+      <w:rFonts w:ascii="Times New Roman" w:hAnsi="Times New Roman" w:cs="Times New Roman" w:eastAsia="Times New Roman"/>
       <w:b/>
       <w:bCs/>
       <w:sz w:val="28"/>
@@ -20216,7 +21019,7 @@
       <w:outlineLvl w:val="2"/>
     </w:pPr>
     <w:rPr>
-      <w:rFonts w:ascii="Times New Roman" w:hAnsi="Times New Roman" w:eastAsia="Times New Roman" w:cs="Times New Roman"/>
+      <w:rFonts w:ascii="Times New Roman" w:hAnsi="Times New Roman" w:cs="Times New Roman" w:eastAsia="Times New Roman"/>
       <w:b/>
       <w:bCs/>
       <w:sz w:val="24"/>
@@ -20300,7 +21103,7 @@
       <w:spacing w:before="240" w:after="120"/>
     </w:pPr>
     <w:rPr>
-      <w:rFonts w:ascii="Liberation Sans" w:hAnsi="Liberation Sans" w:eastAsia="Noto Sans CJK SC" w:cs="Liberation Sans"/>
+      <w:rFonts w:ascii="Times New Roman" w:hAnsi="Times New Roman" w:cs="Times New Roman" w:eastAsia="Times New Roman"/>
       <w:sz w:val="28"/>
       <w:szCs w:val="28"/>
     </w:rPr>
@@ -20318,7 +21121,7 @@
     <w:basedOn w:val="BodyText"/>
     <w:pPr/>
     <w:rPr>
-      <w:rFonts w:cs="Liberation Sans"/>
+      <w:rFonts w:ascii="Times New Roman" w:hAnsi="Times New Roman" w:cs="Times New Roman" w:eastAsia="Times New Roman"/>
     </w:rPr>
   </w:style>
   <w:style w:type="paragraph" w:styleId="Caption">
@@ -20329,7 +21132,7 @@
       <w:spacing w:before="120" w:after="120"/>
     </w:pPr>
     <w:rPr>
-      <w:rFonts w:cs="Liberation Sans"/>
+      <w:rFonts w:ascii="Times New Roman" w:hAnsi="Times New Roman" w:cs="Times New Roman" w:eastAsia="Times New Roman"/>
       <w:i/>
       <w:iCs/>
       <w:sz w:val="24"/>
@@ -20343,7 +21146,7 @@
       <w:suppressLineNumbers/>
     </w:pPr>
     <w:rPr>
-      <w:rFonts w:cs="Liberation Sans"/>
+      <w:rFonts w:ascii="Times New Roman" w:hAnsi="Times New Roman" w:cs="Times New Roman" w:eastAsia="Times New Roman"/>
     </w:rPr>
   </w:style>
   <w:style w:type="paragraph" w:styleId="Title">
@@ -20366,7 +21169,7 @@
       <w:jc w:val="both"/>
     </w:pPr>
     <w:rPr>
-      <w:rFonts w:ascii="Times New Roman" w:hAnsi="Times New Roman" w:eastAsia="Times New Roman" w:cs="Times New Roman"/>
+      <w:rFonts w:ascii="Times New Roman" w:hAnsi="Times New Roman" w:cs="Times New Roman" w:eastAsia="Times New Roman"/>
       <w:b/>
       <w:bCs/>
       <w:color w:val="auto"/>
@@ -20386,7 +21189,7 @@
       <w:jc w:val="both"/>
     </w:pPr>
     <w:rPr>
-      <w:rFonts w:ascii="Times New Roman" w:hAnsi="Times New Roman" w:eastAsia="Times New Roman" w:cs="Times New Roman"/>
+      <w:rFonts w:ascii="Times New Roman" w:hAnsi="Times New Roman" w:cs="Times New Roman" w:eastAsia="Times New Roman"/>
       <w:color w:val="auto"/>
       <w:kern w:val="0"/>
       <w:sz w:val="24"/>
@@ -20420,7 +21223,7 @@
       <w:outlineLvl w:val="0"/>
     </w:pPr>
     <w:rPr>
-      <w:rFonts w:ascii="Times New Roman" w:hAnsi="Times New Roman" w:eastAsia="Times New Roman" w:cs="Times New Roman"/>
+      <w:rFonts w:ascii="Times New Roman" w:hAnsi="Times New Roman" w:cs="Times New Roman" w:eastAsia="Times New Roman"/>
       <w:b/>
       <w:bCs/>
       <w:color w:val="auto"/>
@@ -20442,7 +21245,7 @@
       <w:outlineLvl w:val="0"/>
     </w:pPr>
     <w:rPr>
-      <w:rFonts w:ascii="Times New Roman" w:hAnsi="Times New Roman" w:eastAsia="Times New Roman" w:cs="Times New Roman"/>
+      <w:rFonts w:ascii="Times New Roman" w:hAnsi="Times New Roman" w:cs="Times New Roman" w:eastAsia="Times New Roman"/>
       <w:b/>
       <w:bCs/>
       <w:color w:val="auto"/>
@@ -20462,7 +21265,7 @@
       <w:jc w:val="center"/>
     </w:pPr>
     <w:rPr>
-      <w:rFonts w:ascii="Times New Roman" w:hAnsi="Times New Roman" w:eastAsia="Times New Roman" w:cs="Times New Roman"/>
+      <w:rFonts w:ascii="Times New Roman" w:hAnsi="Times New Roman" w:cs="Times New Roman" w:eastAsia="Times New Roman"/>
       <w:b/>
       <w:bCs/>
       <w:color w:val="auto"/>
@@ -20481,7 +21284,7 @@
       <w:jc w:val="center"/>
     </w:pPr>
     <w:rPr>
-      <w:rFonts w:ascii="Times New Roman" w:hAnsi="Times New Roman" w:eastAsia="Times New Roman" w:cs="Times New Roman"/>
+      <w:rFonts w:ascii="Times New Roman" w:hAnsi="Times New Roman" w:cs="Times New Roman" w:eastAsia="Times New Roman"/>
       <w:color w:val="auto"/>
       <w:kern w:val="0"/>
       <w:sz w:val="22"/>
@@ -20499,7 +21302,7 @@
       <w:jc w:val="center"/>
     </w:pPr>
     <w:rPr>
-      <w:rFonts w:ascii="Times New Roman" w:hAnsi="Times New Roman" w:eastAsia="Times New Roman" w:cs="Times New Roman"/>
+      <w:rFonts w:ascii="Times New Roman" w:hAnsi="Times New Roman" w:cs="Times New Roman" w:eastAsia="Times New Roman"/>
       <w:color w:val="auto"/>
       <w:kern w:val="0"/>
       <w:sz w:val="22"/>
@@ -20516,7 +21319,7 @@
       <w:jc w:val="both"/>
     </w:pPr>
     <w:rPr>
-      <w:rFonts w:ascii="Times New Roman" w:hAnsi="Times New Roman" w:eastAsia="Times New Roman" w:cs="Times New Roman"/>
+      <w:rFonts w:ascii="Times New Roman" w:hAnsi="Times New Roman" w:cs="Times New Roman" w:eastAsia="Times New Roman"/>
       <w:color w:val="auto"/>
       <w:kern w:val="0"/>
       <w:sz w:val="20"/>
@@ -20533,7 +21336,7 @@
       <w:jc w:val="left"/>
     </w:pPr>
     <w:rPr>
-      <w:rFonts w:ascii="Times New Roman" w:hAnsi="Times New Roman" w:eastAsia="Times New Roman" w:cs="Times New Roman"/>
+      <w:rFonts w:ascii="Times New Roman" w:hAnsi="Times New Roman" w:cs="Times New Roman" w:eastAsia="Times New Roman"/>
       <w:i w:val="false"/>
       <w:iCs w:val="false"/>
       <w:color w:val="auto"/>
@@ -20553,7 +21356,7 @@
       <w:jc w:val="left"/>
     </w:pPr>
     <w:rPr>
-      <w:rFonts w:ascii="Courier New" w:hAnsi="Courier New" w:eastAsia="Courier New" w:cs="Courier New"/>
+      <w:rFonts w:ascii="Times New Roman" w:hAnsi="Times New Roman" w:cs="Times New Roman" w:eastAsia="Times New Roman"/>
       <w:color w:val="auto"/>
       <w:kern w:val="0"/>
       <w:sz w:val="17"/>
@@ -20569,7 +21372,7 @@
       <w:jc w:val="left"/>
     </w:pPr>
     <w:rPr>
-      <w:rFonts w:ascii="Times New Roman" w:hAnsi="Times New Roman" w:eastAsia="Times New Roman" w:cs="Times New Roman"/>
+      <w:rFonts w:ascii="Times New Roman" w:hAnsi="Times New Roman" w:cs="Times New Roman" w:eastAsia="Times New Roman"/>
       <w:sz w:val="24"/>
       <w:szCs w:val="24"/>
     </w:rPr>
@@ -20583,7 +21386,7 @@
       <w:jc w:val="left"/>
     </w:pPr>
     <w:rPr>
-      <w:rFonts w:ascii="Times New Roman" w:hAnsi="Times New Roman" w:eastAsia="Times New Roman" w:cs="Times New Roman"/>
+      <w:rFonts w:ascii="Times New Roman" w:hAnsi="Times New Roman" w:cs="Times New Roman" w:eastAsia="Times New Roman"/>
       <w:sz w:val="24"/>
       <w:szCs w:val="24"/>
     </w:rPr>
@@ -20597,7 +21400,7 @@
       <w:jc w:val="left"/>
     </w:pPr>
     <w:rPr>
-      <w:rFonts w:ascii="Times New Roman" w:hAnsi="Times New Roman" w:eastAsia="Times New Roman" w:cs="Times New Roman"/>
+      <w:rFonts w:ascii="Times New Roman" w:hAnsi="Times New Roman" w:cs="Times New Roman" w:eastAsia="Times New Roman"/>
       <w:sz w:val="24"/>
       <w:szCs w:val="24"/>
     </w:rPr>
@@ -20612,7 +21415,7 @@
       <w:jc w:val="left"/>
     </w:pPr>
     <w:rPr>
-      <w:rFonts w:ascii="Times New Roman" w:hAnsi="Times New Roman" w:eastAsia="Times New Roman" w:cs="Times New Roman"/>
+      <w:rFonts w:ascii="Times New Roman" w:hAnsi="Times New Roman" w:cs="Times New Roman" w:eastAsia="Times New Roman"/>
       <w:color w:val="auto"/>
       <w:kern w:val="0"/>
       <w:sz w:val="22"/>
@@ -20678,14 +21481,14 @@
     </a:clrScheme>
     <a:fontScheme name="Office">
       <a:majorFont>
-        <a:latin typeface="Arial" pitchFamily="0" charset="1"/>
-        <a:ea typeface="DejaVu Sans" pitchFamily="0" charset="1"/>
-        <a:cs typeface="DejaVu Sans" pitchFamily="0" charset="1"/>
+        <a:latin typeface="Times New Roman" pitchFamily="0" charset="1"/>
+        <a:ea typeface="Times New Roman" pitchFamily="0" charset="1"/>
+        <a:cs typeface="Times New Roman" pitchFamily="0" charset="1"/>
       </a:majorFont>
       <a:minorFont>
-        <a:latin typeface="Arial" pitchFamily="0" charset="1"/>
-        <a:ea typeface="DejaVu Sans" pitchFamily="0" charset="1"/>
-        <a:cs typeface="DejaVu Sans" pitchFamily="0" charset="1"/>
+        <a:latin typeface="Times New Roman" pitchFamily="0" charset="1"/>
+        <a:ea typeface="Times New Roman" pitchFamily="0" charset="1"/>
+        <a:cs typeface="Times New Roman" pitchFamily="0" charset="1"/>
       </a:minorFont>
     </a:fontScheme>
     <a:fmtScheme>

</xml_diff>